<commit_message>
Pengajuan perizinan dari portal wali + perbaikan login & seeder mock
- Portal wali: form ajukan perizinan lengkap (pilih anak, jenis, tanggal, alasan),
  status selalu diajukan, validasi R1, tampil di dashboard admin
- Role Wali Santri diberi permission Create:Perizinan
- Perbaikan error Select::readOnly di PembayaranResource (disabled+dehydrated)
- Login: gap logo vs "Sign in" + helperText per panel (admin vs wali)
- Landing: hapus section PPDB, tombol jadi Login ke /wali/login
- MockDataSeeder idempotent untuk semua menu (tanpa ubah data asli)
- Optimasi: php-dev/opcache.ini via PHP_INI_SCAN_DIR, cache store file

🤖 Generated with Codebuff
Co-Authored-By: Codebuff <noreply@codebuff.com>
</commit_message>
<xml_diff>
--- a/screenshots/BAB-IV-V-MANAJEMEN-SANTRI.docx
+++ b/screenshots/BAB-IV-V-MANAJEMEN-SANTRI.docx
@@ -26,14 +26,6 @@
             <w:pPr>
               <w:spacing w:after="0" w:line="360" w:lineRule="auto"/>
             </w:pPr>
-            <w:r>
-              <w:rPr>
-                <w:rFonts w:ascii="Times New Roman" w:eastAsia="Times New Roman" w:hAnsi="Times New Roman" w:cs="Times New Roman"/>
-                <w:sz w:val="24"/>
-              </w:rPr>
-              <w:lastRenderedPageBreak/>
-              <w:t>Gambar 4.1  Halaman Utama (Landing Page) Publik Pondok Pesantren Miftahul Ihsan</w:t>
-            </w:r>
           </w:p>
         </w:tc>
         <w:tc>
@@ -99,13 +91,6 @@
             <w:pPr>
               <w:spacing w:after="0" w:line="360" w:lineRule="auto"/>
             </w:pPr>
-            <w:r>
-              <w:rPr>
-                <w:rFonts w:ascii="Times New Roman" w:eastAsia="Times New Roman" w:hAnsi="Times New Roman" w:cs="Times New Roman"/>
-                <w:sz w:val="24"/>
-              </w:rPr>
-              <w:t>Gambar 4.2  Halaman Login Panel Admin</w:t>
-            </w:r>
           </w:p>
         </w:tc>
         <w:tc>
@@ -171,13 +156,6 @@
             <w:pPr>
               <w:spacing w:after="0" w:line="360" w:lineRule="auto"/>
             </w:pPr>
-            <w:r>
-              <w:rPr>
-                <w:rFonts w:ascii="Times New Roman" w:eastAsia="Times New Roman" w:hAnsi="Times New Roman" w:cs="Times New Roman"/>
-                <w:sz w:val="24"/>
-              </w:rPr>
-              <w:t>Gambar 4.3  Halaman Login Portal Wali Santri</w:t>
-            </w:r>
           </w:p>
         </w:tc>
         <w:tc>
@@ -243,13 +221,6 @@
             <w:pPr>
               <w:spacing w:after="0" w:line="360" w:lineRule="auto"/>
             </w:pPr>
-            <w:r>
-              <w:rPr>
-                <w:rFonts w:ascii="Times New Roman" w:eastAsia="Times New Roman" w:hAnsi="Times New Roman" w:cs="Times New Roman"/>
-                <w:sz w:val="24"/>
-              </w:rPr>
-              <w:t>Gambar 4.4  Dashboard Utama Panel Admin</w:t>
-            </w:r>
           </w:p>
         </w:tc>
         <w:tc>
@@ -315,13 +286,6 @@
             <w:pPr>
               <w:spacing w:after="0" w:line="360" w:lineRule="auto"/>
             </w:pPr>
-            <w:r>
-              <w:rPr>
-                <w:rFonts w:ascii="Times New Roman" w:eastAsia="Times New Roman" w:hAnsi="Times New Roman" w:cs="Times New Roman"/>
-                <w:sz w:val="24"/>
-              </w:rPr>
-              <w:t>Gambar 4.5  Halaman Data Santri</w:t>
-            </w:r>
           </w:p>
         </w:tc>
         <w:tc>
@@ -387,13 +351,6 @@
             <w:pPr>
               <w:spacing w:after="0" w:line="360" w:lineRule="auto"/>
             </w:pPr>
-            <w:r>
-              <w:rPr>
-                <w:rFonts w:ascii="Times New Roman" w:eastAsia="Times New Roman" w:hAnsi="Times New Roman" w:cs="Times New Roman"/>
-                <w:sz w:val="24"/>
-              </w:rPr>
-              <w:t>Gambar 4.6  Halaman Data Wali Santri</w:t>
-            </w:r>
           </w:p>
         </w:tc>
         <w:tc>
@@ -459,13 +416,6 @@
             <w:pPr>
               <w:spacing w:after="0" w:line="360" w:lineRule="auto"/>
             </w:pPr>
-            <w:r>
-              <w:rPr>
-                <w:rFonts w:ascii="Times New Roman" w:eastAsia="Times New Roman" w:hAnsi="Times New Roman" w:cs="Times New Roman"/>
-                <w:sz w:val="24"/>
-              </w:rPr>
-              <w:t>Gambar 4.7  Halaman Data Kamar / Asrama</w:t>
-            </w:r>
           </w:p>
         </w:tc>
         <w:tc>
@@ -531,13 +481,6 @@
             <w:pPr>
               <w:spacing w:after="0" w:line="360" w:lineRule="auto"/>
             </w:pPr>
-            <w:r>
-              <w:rPr>
-                <w:rFonts w:ascii="Times New Roman" w:eastAsia="Times New Roman" w:hAnsi="Times New Roman" w:cs="Times New Roman"/>
-                <w:sz w:val="24"/>
-              </w:rPr>
-              <w:t>Gambar 4.8  Halaman Catatan Pelanggaran Santri</w:t>
-            </w:r>
           </w:p>
         </w:tc>
         <w:tc>
@@ -603,13 +546,6 @@
             <w:pPr>
               <w:spacing w:after="0" w:line="360" w:lineRule="auto"/>
             </w:pPr>
-            <w:r>
-              <w:rPr>
-                <w:rFonts w:ascii="Times New Roman" w:eastAsia="Times New Roman" w:hAnsi="Times New Roman" w:cs="Times New Roman"/>
-                <w:sz w:val="24"/>
-              </w:rPr>
-              <w:t>Gambar 4.9  Halaman Penghargaan Santri</w:t>
-            </w:r>
           </w:p>
         </w:tc>
         <w:tc>
@@ -675,13 +611,6 @@
             <w:pPr>
               <w:spacing w:after="0" w:line="360" w:lineRule="auto"/>
             </w:pPr>
-            <w:r>
-              <w:rPr>
-                <w:rFonts w:ascii="Times New Roman" w:eastAsia="Times New Roman" w:hAnsi="Times New Roman" w:cs="Times New Roman"/>
-                <w:sz w:val="24"/>
-              </w:rPr>
-              <w:t>Gambar 4.10  Halaman Tagihan Santri</w:t>
-            </w:r>
           </w:p>
         </w:tc>
         <w:tc>
@@ -747,13 +676,6 @@
             <w:pPr>
               <w:spacing w:after="0" w:line="360" w:lineRule="auto"/>
             </w:pPr>
-            <w:r>
-              <w:rPr>
-                <w:rFonts w:ascii="Times New Roman" w:eastAsia="Times New Roman" w:hAnsi="Times New Roman" w:cs="Times New Roman"/>
-                <w:sz w:val="24"/>
-              </w:rPr>
-              <w:t>Gambar 4.11  Halaman Catatan Pembayaran</w:t>
-            </w:r>
           </w:p>
         </w:tc>
         <w:tc>
@@ -819,13 +741,6 @@
             <w:pPr>
               <w:spacing w:after="0" w:line="360" w:lineRule="auto"/>
             </w:pPr>
-            <w:r>
-              <w:rPr>
-                <w:rFonts w:ascii="Times New Roman" w:eastAsia="Times New Roman" w:hAnsi="Times New Roman" w:cs="Times New Roman"/>
-                <w:sz w:val="24"/>
-              </w:rPr>
-              <w:t>Gambar 4.12  Halaman Pengajuan Perizinan Santri</w:t>
-            </w:r>
           </w:p>
         </w:tc>
         <w:tc>
@@ -891,13 +806,6 @@
             <w:pPr>
               <w:spacing w:after="0" w:line="360" w:lineRule="auto"/>
             </w:pPr>
-            <w:r>
-              <w:rPr>
-                <w:rFonts w:ascii="Times New Roman" w:eastAsia="Times New Roman" w:hAnsi="Times New Roman" w:cs="Times New Roman"/>
-                <w:sz w:val="24"/>
-              </w:rPr>
-              <w:t>Gambar 4.13  Halaman Catatan Tahfidz Santri</w:t>
-            </w:r>
           </w:p>
         </w:tc>
         <w:tc>
@@ -963,13 +871,6 @@
             <w:pPr>
               <w:spacing w:after="0" w:line="360" w:lineRule="auto"/>
             </w:pPr>
-            <w:r>
-              <w:rPr>
-                <w:rFonts w:ascii="Times New Roman" w:eastAsia="Times New Roman" w:hAnsi="Times New Roman" w:cs="Times New Roman"/>
-                <w:sz w:val="24"/>
-              </w:rPr>
-              <w:t>Gambar 4.14  Halaman Riwayat Kesehatan Santri</w:t>
-            </w:r>
           </w:p>
         </w:tc>
         <w:tc>
@@ -1035,13 +936,6 @@
             <w:pPr>
               <w:spacing w:after="0" w:line="360" w:lineRule="auto"/>
             </w:pPr>
-            <w:r>
-              <w:rPr>
-                <w:rFonts w:ascii="Times New Roman" w:eastAsia="Times New Roman" w:hAnsi="Times New Roman" w:cs="Times New Roman"/>
-                <w:sz w:val="24"/>
-              </w:rPr>
-              <w:t>Gambar 4.15  Halaman Data Pengurus</w:t>
-            </w:r>
           </w:p>
         </w:tc>
         <w:tc>
@@ -1107,13 +1001,6 @@
             <w:pPr>
               <w:spacing w:after="0" w:line="360" w:lineRule="auto"/>
             </w:pPr>
-            <w:r>
-              <w:rPr>
-                <w:rFonts w:ascii="Times New Roman" w:eastAsia="Times New Roman" w:hAnsi="Times New Roman" w:cs="Times New Roman"/>
-                <w:sz w:val="24"/>
-              </w:rPr>
-              <w:t>Gambar 4.16  Halaman Manajemen Pengguna</w:t>
-            </w:r>
           </w:p>
         </w:tc>
         <w:tc>
@@ -1179,13 +1066,6 @@
             <w:pPr>
               <w:spacing w:after="0" w:line="360" w:lineRule="auto"/>
             </w:pPr>
-            <w:r>
-              <w:rPr>
-                <w:rFonts w:ascii="Times New Roman" w:eastAsia="Times New Roman" w:hAnsi="Times New Roman" w:cs="Times New Roman"/>
-                <w:sz w:val="24"/>
-              </w:rPr>
-              <w:t>Gambar 4.17  Halaman WhatsApp Gateway (Kelola Sesi Sidecar)</w:t>
-            </w:r>
           </w:p>
         </w:tc>
         <w:tc>
@@ -1209,14 +1089,7 @@
                 <w:rFonts w:ascii="Times New Roman" w:eastAsia="Times New Roman" w:hAnsi="Times New Roman" w:cs="Times New Roman"/>
                 <w:sz w:val="24"/>
               </w:rPr>
-              <w:instrText xml:space="preserve"> PAGEREF fig</w:instrText>
-            </w:r>
-            <w:r>
-              <w:rPr>
-                <w:rFonts w:ascii="Times New Roman" w:eastAsia="Times New Roman" w:hAnsi="Times New Roman" w:cs="Times New Roman"/>
-                <w:sz w:val="24"/>
-              </w:rPr>
-              <w:instrText xml:space="preserve">4_17 \h </w:instrText>
+              <w:instrText xml:space="preserve"> PAGEREF fig4_17 \h </w:instrText>
             </w:r>
             <w:r>
               <w:rPr>
@@ -1258,13 +1131,6 @@
             <w:pPr>
               <w:spacing w:after="0" w:line="360" w:lineRule="auto"/>
             </w:pPr>
-            <w:r>
-              <w:rPr>
-                <w:rFonts w:ascii="Times New Roman" w:eastAsia="Times New Roman" w:hAnsi="Times New Roman" w:cs="Times New Roman"/>
-                <w:sz w:val="24"/>
-              </w:rPr>
-              <w:t>Gambar 4.18  Halaman Templat WhatsApp</w:t>
-            </w:r>
           </w:p>
         </w:tc>
         <w:tc>
@@ -1330,13 +1196,6 @@
             <w:pPr>
               <w:spacing w:after="0" w:line="360" w:lineRule="auto"/>
             </w:pPr>
-            <w:r>
-              <w:rPr>
-                <w:rFonts w:ascii="Times New Roman" w:eastAsia="Times New Roman" w:hAnsi="Times New Roman" w:cs="Times New Roman"/>
-                <w:sz w:val="24"/>
-              </w:rPr>
-              <w:t>Gambar 4.19  Halaman Log Notifikasi WhatsApp</w:t>
-            </w:r>
           </w:p>
         </w:tc>
         <w:tc>
@@ -1360,14 +1219,7 @@
                 <w:rFonts w:ascii="Times New Roman" w:eastAsia="Times New Roman" w:hAnsi="Times New Roman" w:cs="Times New Roman"/>
                 <w:sz w:val="24"/>
               </w:rPr>
-              <w:instrText xml:space="preserve"> PAGEREF fig4_19 </w:instrText>
-            </w:r>
-            <w:r>
-              <w:rPr>
-                <w:rFonts w:ascii="Times New Roman" w:eastAsia="Times New Roman" w:hAnsi="Times New Roman" w:cs="Times New Roman"/>
-                <w:sz w:val="24"/>
-              </w:rPr>
-              <w:instrText xml:space="preserve">\h </w:instrText>
+              <w:instrText xml:space="preserve"> PAGEREF fig4_19 \h </w:instrText>
             </w:r>
             <w:r>
               <w:rPr>
@@ -1409,13 +1261,6 @@
             <w:pPr>
               <w:spacing w:after="0" w:line="360" w:lineRule="auto"/>
             </w:pPr>
-            <w:r>
-              <w:rPr>
-                <w:rFonts w:ascii="Times New Roman" w:eastAsia="Times New Roman" w:hAnsi="Times New Roman" w:cs="Times New Roman"/>
-                <w:sz w:val="24"/>
-              </w:rPr>
-              <w:t>Gambar 4.20  Halaman Pengaturan Peran &amp; Izin (Filament Shield)</w:t>
-            </w:r>
           </w:p>
         </w:tc>
         <w:tc>
@@ -1481,20 +1326,6 @@
             <w:pPr>
               <w:spacing w:after="0" w:line="360" w:lineRule="auto"/>
             </w:pPr>
-            <w:r>
-              <w:rPr>
-                <w:rFonts w:ascii="Times New Roman" w:eastAsia="Times New Roman" w:hAnsi="Times New Roman" w:cs="Times New Roman"/>
-                <w:sz w:val="24"/>
-              </w:rPr>
-              <w:t xml:space="preserve">Gambar 4.21  Halaman </w:t>
-            </w:r>
-            <w:r>
-              <w:rPr>
-                <w:rFonts w:ascii="Times New Roman" w:eastAsia="Times New Roman" w:hAnsi="Times New Roman" w:cs="Times New Roman"/>
-                <w:sz w:val="24"/>
-              </w:rPr>
-              <w:t>Pengaturan Rule Poin Kedisiplinan</w:t>
-            </w:r>
           </w:p>
         </w:tc>
         <w:tc>
@@ -1560,13 +1391,6 @@
             <w:pPr>
               <w:spacing w:after="0" w:line="360" w:lineRule="auto"/>
             </w:pPr>
-            <w:r>
-              <w:rPr>
-                <w:rFonts w:ascii="Times New Roman" w:eastAsia="Times New Roman" w:hAnsi="Times New Roman" w:cs="Times New Roman"/>
-                <w:sz w:val="24"/>
-              </w:rPr>
-              <w:t>Gambar 4.22  Dashboard Portal Wali Santri</w:t>
-            </w:r>
           </w:p>
         </w:tc>
         <w:tc>
@@ -1632,13 +1456,6 @@
             <w:pPr>
               <w:spacing w:after="0" w:line="360" w:lineRule="auto"/>
             </w:pPr>
-            <w:r>
-              <w:rPr>
-                <w:rFonts w:ascii="Times New Roman" w:eastAsia="Times New Roman" w:hAnsi="Times New Roman" w:cs="Times New Roman"/>
-                <w:sz w:val="24"/>
-              </w:rPr>
-              <w:t>Gambar 4.23  Halaman Data Santri pada Portal Wali</w:t>
-            </w:r>
           </w:p>
         </w:tc>
         <w:tc>
@@ -1704,13 +1521,6 @@
             <w:pPr>
               <w:spacing w:after="0" w:line="360" w:lineRule="auto"/>
             </w:pPr>
-            <w:r>
-              <w:rPr>
-                <w:rFonts w:ascii="Times New Roman" w:eastAsia="Times New Roman" w:hAnsi="Times New Roman" w:cs="Times New Roman"/>
-                <w:sz w:val="24"/>
-              </w:rPr>
-              <w:t>Gambar 4.24  Halaman Pelanggaran Anak pada Portal Wali</w:t>
-            </w:r>
           </w:p>
         </w:tc>
         <w:tc>
@@ -1734,14 +1544,7 @@
                 <w:rFonts w:ascii="Times New Roman" w:eastAsia="Times New Roman" w:hAnsi="Times New Roman" w:cs="Times New Roman"/>
                 <w:sz w:val="24"/>
               </w:rPr>
-              <w:instrText xml:space="preserve"> PAGERE</w:instrText>
-            </w:r>
-            <w:r>
-              <w:rPr>
-                <w:rFonts w:ascii="Times New Roman" w:eastAsia="Times New Roman" w:hAnsi="Times New Roman" w:cs="Times New Roman"/>
-                <w:sz w:val="24"/>
-              </w:rPr>
-              <w:instrText xml:space="preserve">F fig4_24 \h </w:instrText>
+              <w:instrText xml:space="preserve"> PAGEREF fig4_24 \h </w:instrText>
             </w:r>
             <w:r>
               <w:rPr>
@@ -1783,13 +1586,6 @@
             <w:pPr>
               <w:spacing w:after="0" w:line="360" w:lineRule="auto"/>
             </w:pPr>
-            <w:r>
-              <w:rPr>
-                <w:rFonts w:ascii="Times New Roman" w:eastAsia="Times New Roman" w:hAnsi="Times New Roman" w:cs="Times New Roman"/>
-                <w:sz w:val="24"/>
-              </w:rPr>
-              <w:t>Gambar 4.25  Halaman Tagihan Anak pada Portal Wali</w:t>
-            </w:r>
           </w:p>
         </w:tc>
         <w:tc>
@@ -1855,20 +1651,6 @@
             <w:pPr>
               <w:spacing w:after="0" w:line="360" w:lineRule="auto"/>
             </w:pPr>
-            <w:r>
-              <w:rPr>
-                <w:rFonts w:ascii="Times New Roman" w:eastAsia="Times New Roman" w:hAnsi="Times New Roman" w:cs="Times New Roman"/>
-                <w:sz w:val="24"/>
-              </w:rPr>
-              <w:t>Gambar 4.26  Halaman Tahfidz Anak pada Por</w:t>
-            </w:r>
-            <w:r>
-              <w:rPr>
-                <w:rFonts w:ascii="Times New Roman" w:eastAsia="Times New Roman" w:hAnsi="Times New Roman" w:cs="Times New Roman"/>
-                <w:sz w:val="24"/>
-              </w:rPr>
-              <w:t>tal Wali</w:t>
-            </w:r>
           </w:p>
         </w:tc>
         <w:tc>
@@ -1934,13 +1716,6 @@
             <w:pPr>
               <w:spacing w:after="0" w:line="360" w:lineRule="auto"/>
             </w:pPr>
-            <w:r>
-              <w:rPr>
-                <w:rFonts w:ascii="Times New Roman" w:eastAsia="Times New Roman" w:hAnsi="Times New Roman" w:cs="Times New Roman"/>
-                <w:sz w:val="24"/>
-              </w:rPr>
-              <w:t>Gambar 4.27  Halaman Perizinan Anak pada Portal Wali</w:t>
-            </w:r>
           </w:p>
         </w:tc>
         <w:tc>
@@ -2001,17 +1776,12 @@
     <w:p>
       <w:pPr>
         <w:pStyle w:val="Heading1"/>
-        <w:spacing w:before="0" w:after="240" w:line="360" w:lineRule="auto"/>
-        <w:jc w:val="center"/>
-      </w:pPr>
-      <w:r>
+        <w:spacing w:before="0" w:after="120" w:line="360" w:lineRule="auto"/>
         <w:rPr>
           <w:rFonts w:ascii="Times New Roman" w:eastAsia="Times New Roman" w:hAnsi="Times New Roman" w:cs="Times New Roman"/>
           <w:sz w:val="24"/>
         </w:rPr>
-        <w:lastRenderedPageBreak/>
-        <w:t>DAFTAR GAMBAR</w:t>
-      </w:r>
+      </w:pPr>
     </w:p>
     <w:p>
       <w:pPr>
@@ -2061,21 +1831,7 @@
           <w:rFonts w:ascii="Times New Roman" w:eastAsia="Times New Roman" w:hAnsi="Times New Roman" w:cs="Times New Roman"/>
           <w:sz w:val="24"/>
         </w:rPr>
-        <w:t xml:space="preserve">Bab ini menyajikan hasil implementasi dan pengujian Sistem Informasi Manajemen Santri Pondok Pesantren Miftahul Ihsan (SIMANSA) </w:t>
-      </w:r>
-      <w:r>
-        <w:rPr>
-          <w:rFonts w:ascii="Times New Roman" w:eastAsia="Times New Roman" w:hAnsi="Times New Roman" w:cs="Times New Roman"/>
-          <w:sz w:val="24"/>
-        </w:rPr>
-        <w:t>berbasis web. Sistem dibangun dengan tujuan mengotomatisasi pengelolaan data santri, pencatatan kedisiplinan (pelanggaran dan penghargaan), manajemen tagihan dan pembayaran, pengajuan perizinan, pencatatan tahfidz, serta penyampaian notifikasi otomatis kep</w:t>
-      </w:r>
-      <w:r>
-        <w:rPr>
-          <w:rFonts w:ascii="Times New Roman" w:eastAsia="Times New Roman" w:hAnsi="Times New Roman" w:cs="Times New Roman"/>
-          <w:sz w:val="24"/>
-        </w:rPr>
-        <w:t>ada wali santri melalui WhatsApp Gateway. Sistem juga menyediakan portal mandiri bagi wali santri untuk memantau perkembangan anak secara real-time.</w:t>
+        <w:t>Bab ini menyajikan hasil implementasi dan pengujian Sistem Informasi Manajemen Santri Pondok Pesantren Miftahul Ihsan (SIMANSA) berbasis web. Sistem dibangun dengan tujuan mengotomatisasi pengelolaan data santri, pencatatan kedisiplinan (pelanggaran dan penghargaan), manajemen tagihan dan pembayaran, pengajuan perizinan, pencatatan tahfidz, serta penyampaian notifikasi otomatis kepada wali santri melalui WhatsApp Gateway. Sistem juga menyediakan portal mandiri bagi wali santri untuk memantau perkembangan anak secara real-time.</w:t>
       </w:r>
     </w:p>
     <w:p>
@@ -2102,14 +1858,21 @@
           <w:rFonts w:ascii="Times New Roman" w:eastAsia="Times New Roman" w:hAnsi="Times New Roman" w:cs="Times New Roman"/>
           <w:sz w:val="24"/>
         </w:rPr>
-        <w:t>Sistem dikembangkan dan diuji coba pada lingkungan dengan spesifikasi perang</w:t>
+        <w:t>Sistem dikembangkan dan diuji coba pada lingkungan dengan spesifikasi perangkat keras dan perangkat lunak sebagai berikut:</w:t>
       </w:r>
+    </w:p>
+    <w:p>
+      <w:pPr>
+        <w:spacing w:after="0" w:line="360" w:lineRule="auto"/>
+        <w:ind w:firstLine="426"/>
+        <w:jc w:val="both"/>
+      </w:pPr>
       <w:r>
         <w:rPr>
           <w:rFonts w:ascii="Times New Roman" w:eastAsia="Times New Roman" w:hAnsi="Times New Roman" w:cs="Times New Roman"/>
           <w:sz w:val="24"/>
         </w:rPr>
-        <w:t>kat keras dan perangkat lunak sebagai berikut:</w:t>
+        <w:t>1. Spesifikasi Perangkat Keras (Hardware): Pengembangan dilakukan pada unit PC/Laptop berbasis prosesor Intel Core i5/i7 generasi modern, memori utama (RAM) 8-16 GB, dan media penyimpanan SSD. Server aplikasi dijalankan secara lokal menggunakan Laragon (Apache/Nginx + PHP) dan dapat dipindahkan ke VPS/Cloud Server pada tahap produksi.</w:t>
       </w:r>
     </w:p>
     <w:p>
@@ -2123,63 +1886,21 @@
           <w:rFonts w:ascii="Times New Roman" w:eastAsia="Times New Roman" w:hAnsi="Times New Roman" w:cs="Times New Roman"/>
           <w:sz w:val="24"/>
         </w:rPr>
-        <w:t xml:space="preserve">1. Spesifikasi Perangkat Keras (Hardware): Pengembangan dilakukan pada unit PC/Laptop berbasis prosesor Intel Core i5/i7 generasi modern, memori utama (RAM) 8-16 GB, dan media penyimpanan SSD. Server aplikasi </w:t>
+        <w:t>2. Spesifikasi Perangkat Lunak (Software): Sistem beroperasi pada Sistem Operasi Microsoft Windows 11 (pengembangan) dan Linux (produksi). Bahasa pemrograman utama adalah PHP 8.3 dengan framework Laravel 13, panel administrasi Filament v5, database MySQL 8.0, serta Node.js 20+ dan Vite untuk pembangunan aset frontend.</w:t>
       </w:r>
+    </w:p>
+    <w:p>
+      <w:pPr>
+        <w:spacing w:after="0" w:line="360" w:lineRule="auto"/>
+        <w:ind w:firstLine="426"/>
+        <w:jc w:val="both"/>
+      </w:pPr>
       <w:r>
         <w:rPr>
           <w:rFonts w:ascii="Times New Roman" w:eastAsia="Times New Roman" w:hAnsi="Times New Roman" w:cs="Times New Roman"/>
           <w:sz w:val="24"/>
         </w:rPr>
-        <w:t>dijalankan secara lokal menggunakan Laragon (Apache/Nginx + PHP) dan dapat dipindahkan ke VPS/Cloud Server pada tahap produksi.</w:t>
-      </w:r>
-    </w:p>
-    <w:p>
-      <w:pPr>
-        <w:spacing w:after="0" w:line="360" w:lineRule="auto"/>
-        <w:ind w:firstLine="426"/>
-        <w:jc w:val="both"/>
-      </w:pPr>
-      <w:r>
-        <w:rPr>
-          <w:rFonts w:ascii="Times New Roman" w:eastAsia="Times New Roman" w:hAnsi="Times New Roman" w:cs="Times New Roman"/>
-          <w:sz w:val="24"/>
-        </w:rPr>
-        <w:t>2. Spesifikasi Perangkat Lunak (Software): Sistem beroperasi pada Sistem Operasi Microsoft Windows 11 (pengembangan) dan Linux (</w:t>
-      </w:r>
-      <w:r>
-        <w:rPr>
-          <w:rFonts w:ascii="Times New Roman" w:eastAsia="Times New Roman" w:hAnsi="Times New Roman" w:cs="Times New Roman"/>
-          <w:sz w:val="24"/>
-        </w:rPr>
-        <w:t>produksi). Bahasa pemrograman utama adalah PHP 8.3 dengan framework Laravel 13, panel administrasi Filament v5, database MySQL 8.0, serta Node.js 20+ dan Vite untuk pembangunan aset frontend.</w:t>
-      </w:r>
-    </w:p>
-    <w:p>
-      <w:pPr>
-        <w:spacing w:after="0" w:line="360" w:lineRule="auto"/>
-        <w:ind w:firstLine="426"/>
-        <w:jc w:val="both"/>
-      </w:pPr>
-      <w:r>
-        <w:rPr>
-          <w:rFonts w:ascii="Times New Roman" w:eastAsia="Times New Roman" w:hAnsi="Times New Roman" w:cs="Times New Roman"/>
-          <w:sz w:val="24"/>
-        </w:rPr>
-        <w:t>3. Tech Stack dan Pustaka Pendukung: Arsitektur memanfaatkan Liv</w:t>
-      </w:r>
-      <w:r>
-        <w:rPr>
-          <w:rFonts w:ascii="Times New Roman" w:eastAsia="Times New Roman" w:hAnsi="Times New Roman" w:cs="Times New Roman"/>
-          <w:sz w:val="24"/>
-        </w:rPr>
-        <w:t>ewire untuk komponen UI dinamis, Spatie Laravel Permission dan Filament Shield untuk kontrol hak akses berbasis peran (RBAC), laravel-whatsapp (Web Sidecar berbasis whatsapp-web.js) untuk pengiriman notifikasi WhatsApp dengan status sesi live via Server-Se</w:t>
-      </w:r>
-      <w:r>
-        <w:rPr>
-          <w:rFonts w:ascii="Times New Roman" w:eastAsia="Times New Roman" w:hAnsi="Times New Roman" w:cs="Times New Roman"/>
-          <w:sz w:val="24"/>
-        </w:rPr>
-        <w:t xml:space="preserve">nt Events (SSE), serta Spatie Media Library untuk </w:t>
+        <w:t xml:space="preserve">3. Tech Stack dan Pustaka Pendukung: Arsitektur memanfaatkan Livewire untuk komponen UI dinamis, Spatie Laravel Permission dan Filament Shield untuk kontrol hak akses berbasis peran (RBAC), laravel-whatsapp (Web Sidecar berbasis whatsapp-web.js) untuk pengiriman notifikasi WhatsApp dengan status sesi live via Server-Sent Events (SSE), serta Spatie Media Library untuk </w:t>
       </w:r>
       <w:r>
         <w:rPr>
@@ -2324,14 +2045,7 @@
                 <w:rFonts w:ascii="Times New Roman" w:eastAsia="Times New Roman" w:hAnsi="Times New Roman" w:cs="Times New Roman"/>
                 <w:sz w:val="20"/>
               </w:rPr>
-              <w:t xml:space="preserve">Windows 11 / </w:t>
-            </w:r>
-            <w:r>
-              <w:rPr>
-                <w:rFonts w:ascii="Times New Roman" w:eastAsia="Times New Roman" w:hAnsi="Times New Roman" w:cs="Times New Roman"/>
-                <w:sz w:val="20"/>
-              </w:rPr>
-              <w:t>Ubuntu 22.04 LTS</w:t>
+              <w:t>Windows 11 / Ubuntu 22.04 LTS</w:t>
             </w:r>
           </w:p>
         </w:tc>
@@ -2576,14 +2290,7 @@
                 <w:rFonts w:ascii="Times New Roman" w:eastAsia="Times New Roman" w:hAnsi="Times New Roman" w:cs="Times New Roman"/>
                 <w:sz w:val="20"/>
               </w:rPr>
-              <w:t xml:space="preserve">Server lokal &amp; </w:t>
-            </w:r>
-            <w:r>
-              <w:rPr>
-                <w:rFonts w:ascii="Times New Roman" w:eastAsia="Times New Roman" w:hAnsi="Times New Roman" w:cs="Times New Roman"/>
-                <w:sz w:val="20"/>
-              </w:rPr>
-              <w:t>produksi</w:t>
+              <w:t>Server lokal &amp; produksi</w:t>
             </w:r>
           </w:p>
         </w:tc>
@@ -2770,43 +2477,49 @@
           <w:rFonts w:ascii="Times New Roman" w:eastAsia="Times New Roman" w:hAnsi="Times New Roman" w:cs="Times New Roman"/>
           <w:sz w:val="24"/>
         </w:rPr>
-        <w:t>4.1.2  Implementasi Antar</w:t>
+        <w:t>4.1.2  Implementasi Antarmuka Landing Page &amp; Autentikasi</w:t>
       </w:r>
+    </w:p>
+    <w:p>
+      <w:pPr>
+        <w:spacing w:after="0" w:line="360" w:lineRule="auto"/>
+        <w:ind w:firstLine="426"/>
+        <w:jc w:val="both"/>
+        <w:rPr>
+          <w:rFonts w:ascii="Times New Roman" w:eastAsia="Times New Roman" w:hAnsi="Times New Roman" w:cs="Times New Roman"/>
+          <w:sz w:val="24"/>
+        </w:rPr>
+      </w:pPr>
       <w:r>
         <w:rPr>
           <w:rFonts w:ascii="Times New Roman" w:eastAsia="Times New Roman" w:hAnsi="Times New Roman" w:cs="Times New Roman"/>
           <w:sz w:val="24"/>
         </w:rPr>
-        <w:t>muka Landing Page &amp; Autentikasi</w:t>
+        <w:t xml:space="preserve">Landing page publik dirancang sesuai arahan PRD dengan palet warna khas pondok (hijau songkok, emas sepuh, dan kertas kitab), tipografi Fraunces/Karla, serta animasi reveal-on-scroll yang modern dan responsif di seluruh perangkat. Seluruh informasi pada landing page diambil dari dokumen PRD, mencakup profil pengasuh, sejarah dan sanad keilmuan, visi-misi, keunggulan, unit pendidikan, kurikulum, layanan, fasilitas, prestasi, galeri, testimoni, berita, hingga </w:t>
       </w:r>
-    </w:p>
-    <w:p>
-      <w:pPr>
-        <w:spacing w:after="0" w:line="360" w:lineRule="auto"/>
-        <w:ind w:firstLine="426"/>
-        <w:jc w:val="both"/>
-      </w:pPr>
+      <w:proofErr w:type="spellStart"/>
       <w:r>
         <w:rPr>
           <w:rFonts w:ascii="Times New Roman" w:eastAsia="Times New Roman" w:hAnsi="Times New Roman" w:cs="Times New Roman"/>
           <w:sz w:val="24"/>
         </w:rPr>
-        <w:t xml:space="preserve">Landing page publik dirancang sesuai arahan PRD dengan palet warna khas pondok (hijau songkok, emas sepuh, dan kertas kitab), tipografi Fraunces/Karla, serta animasi reveal-on-scroll yang modern dan responsif di </w:t>
+        <w:t>formulir</w:t>
       </w:r>
+      <w:proofErr w:type="spellEnd"/>
       <w:r>
         <w:rPr>
           <w:rFonts w:ascii="Times New Roman" w:eastAsia="Times New Roman" w:hAnsi="Times New Roman" w:cs="Times New Roman"/>
           <w:sz w:val="24"/>
         </w:rPr>
-        <w:t>seluruh perangkat. Seluruh informasi pada landing page diambil dari dokumen PRD, mencakup profil pengasuh, sejarah dan sanad keilmuan, visi-misi, keunggulan, unit pendidikan, kurikulum, layanan, fasilitas, prestasi, galeri, testimoni, berita, hingga formul</w:t>
+        <w:t xml:space="preserve"> PPDB dan FAQ.</w:t>
       </w:r>
-      <w:r>
-        <w:rPr>
-          <w:rFonts w:ascii="Times New Roman" w:eastAsia="Times New Roman" w:hAnsi="Times New Roman" w:cs="Times New Roman"/>
-          <w:sz w:val="24"/>
-        </w:rPr>
-        <w:t>ir PPDB dan FAQ.</w:t>
-      </w:r>
+    </w:p>
+    <w:p>
+      <w:pPr>
+        <w:spacing w:after="0" w:line="360" w:lineRule="auto"/>
+        <w:ind w:firstLine="426"/>
+        <w:jc w:val="both"/>
+      </w:pPr>
     </w:p>
     <w:p>
       <w:pPr>
@@ -2819,10 +2532,10 @@
         </w:rPr>
         <w:lastRenderedPageBreak/>
         <w:drawing>
-          <wp:inline distT="0" distB="0" distL="0" distR="0" wp14:anchorId="741BB6AF" wp14:editId="663C5347">
-            <wp:extent cx="349531" cy="3200400"/>
-            <wp:effectExtent l="0" t="0" r="0" b="0"/>
-            <wp:docPr id="1" name="Picture 1"/>
+          <wp:inline distT="0" distB="0" distL="0" distR="0" wp14:anchorId="3106E1FB" wp14:editId="2502B504">
+            <wp:extent cx="5156507" cy="2543175"/>
+            <wp:effectExtent l="0" t="0" r="6350" b="0"/>
+            <wp:docPr id="30" name="Picture 30"/>
             <wp:cNvGraphicFramePr>
               <a:graphicFrameLocks xmlns:a="http://schemas.openxmlformats.org/drawingml/2006/main" noChangeAspect="1"/>
             </wp:cNvGraphicFramePr>
@@ -2830,7 +2543,7 @@
               <a:graphicData uri="http://schemas.openxmlformats.org/drawingml/2006/picture">
                 <pic:pic xmlns:pic="http://schemas.openxmlformats.org/drawingml/2006/picture">
                   <pic:nvPicPr>
-                    <pic:cNvPr id="0" name="01_publik_landing.png"/>
+                    <pic:cNvPr id="30" name="Picture 30"/>
                     <pic:cNvPicPr/>
                   </pic:nvPicPr>
                   <pic:blipFill>
@@ -2842,7 +2555,7 @@
                   <pic:spPr>
                     <a:xfrm>
                       <a:off x="0" y="0"/>
-                      <a:ext cx="349531" cy="3200400"/>
+                      <a:ext cx="5163884" cy="2546814"/>
                     </a:xfrm>
                     <a:prstGeom prst="rect">
                       <a:avLst/>
@@ -2868,7 +2581,16 @@
           <w:color w:val="000000"/>
           <w:sz w:val="22"/>
         </w:rPr>
-        <w:t xml:space="preserve">Gambar 4.1  </w:t>
+        <w:t xml:space="preserve">Gambar </w:t>
+      </w:r>
+      <w:proofErr w:type="gramStart"/>
+      <w:r>
+        <w:rPr>
+          <w:rFonts w:ascii="Times New Roman" w:eastAsia="Times New Roman" w:hAnsi="Times New Roman" w:cs="Times New Roman"/>
+          <w:color w:val="000000"/>
+          <w:sz w:val="22"/>
+        </w:rPr>
+        <w:t xml:space="preserve">4.1  </w:t>
       </w:r>
       <w:r>
         <w:rPr>
@@ -2877,7 +2599,17 @@
           <w:color w:val="000000"/>
           <w:sz w:val="22"/>
         </w:rPr>
-        <w:t>Halaman Utama (Landing Page) Publik Pondok Pesantren Miftahul Ihsan</w:t>
+        <w:t>Halaman</w:t>
+      </w:r>
+      <w:proofErr w:type="gramEnd"/>
+      <w:r>
+        <w:rPr>
+          <w:rFonts w:ascii="Times New Roman" w:eastAsia="Times New Roman" w:hAnsi="Times New Roman" w:cs="Times New Roman"/>
+          <w:b w:val="0"/>
+          <w:color w:val="000000"/>
+          <w:sz w:val="22"/>
+        </w:rPr>
+        <w:t xml:space="preserve"> Utama (Landing Page) Publik Pondok Pesantren Miftahul Ihsan</w:t>
       </w:r>
       <w:bookmarkEnd w:id="0"/>
     </w:p>
@@ -2892,14 +2624,7 @@
           <w:rFonts w:ascii="Times New Roman" w:eastAsia="Times New Roman" w:hAnsi="Times New Roman" w:cs="Times New Roman"/>
           <w:sz w:val="24"/>
         </w:rPr>
-        <w:t>Halaman utama menampilkan hero section dengan identitas pondok, statistik singkat (jumlah santri, ustadz, dan unit pendidikan), serta tautan menuju halaman p</w:t>
-      </w:r>
-      <w:r>
-        <w:rPr>
-          <w:rFonts w:ascii="Times New Roman" w:eastAsia="Times New Roman" w:hAnsi="Times New Roman" w:cs="Times New Roman"/>
-          <w:sz w:val="24"/>
-        </w:rPr>
-        <w:t>endaftaran dan portal login.</w:t>
+        <w:t>Halaman utama menampilkan hero section dengan identitas pondok, statistik singkat (jumlah santri, ustadz, dan unit pendidikan), serta tautan menuju halaman pendaftaran dan portal login.</w:t>
       </w:r>
     </w:p>
     <w:p>
@@ -2985,15 +2710,7 @@
           <w:rFonts w:ascii="Times New Roman" w:eastAsia="Times New Roman" w:hAnsi="Times New Roman" w:cs="Times New Roman"/>
           <w:sz w:val="24"/>
         </w:rPr>
-        <w:lastRenderedPageBreak/>
-        <w:t>Halaman login panel admin menampilkan logo dan identitas "PP. Miftahul Ihsan" secara vertikal di bagian atas. Autentikasi menerima username atau nomor HP beserta kata sandi, dilindungi to</w:t>
-      </w:r>
-      <w:r>
-        <w:rPr>
-          <w:rFonts w:ascii="Times New Roman" w:eastAsia="Times New Roman" w:hAnsi="Times New Roman" w:cs="Times New Roman"/>
-          <w:sz w:val="24"/>
-        </w:rPr>
-        <w:t>ken CSRF, dan diarahkan sesuai peran pengguna.</w:t>
+        <w:t>Halaman login panel admin menampilkan logo dan identitas "PP. Miftahul Ihsan" secara vertikal di bagian atas. Autentikasi menerima username atau nomor HP beserta kata sandi, dilindungi token CSRF, dan diarahkan sesuai peran pengguna.</w:t>
       </w:r>
     </w:p>
     <w:p>
@@ -3005,6 +2722,7 @@
         <w:rPr>
           <w:noProof/>
         </w:rPr>
+        <w:lastRenderedPageBreak/>
         <w:drawing>
           <wp:inline distT="0" distB="0" distL="0" distR="0" wp14:anchorId="4F570836" wp14:editId="58E2DF39">
             <wp:extent cx="5038344" cy="3148965"/>
@@ -3079,14 +2797,7 @@
           <w:rFonts w:ascii="Times New Roman" w:eastAsia="Times New Roman" w:hAnsi="Times New Roman" w:cs="Times New Roman"/>
           <w:sz w:val="24"/>
         </w:rPr>
-        <w:t>Portal wali santri dapat diakses menggunakan nomor HP terdaftar dan kata sandi. Format nomor HP fleksibel (dengan atau tanpa tanda hubung) sehingga memudahkan ora</w:t>
-      </w:r>
-      <w:r>
-        <w:rPr>
-          <w:rFonts w:ascii="Times New Roman" w:eastAsia="Times New Roman" w:hAnsi="Times New Roman" w:cs="Times New Roman"/>
-          <w:sz w:val="24"/>
-        </w:rPr>
-        <w:t>ng tua santri dalam melakukan autentikasi.</w:t>
+        <w:t>Portal wali santri dapat diakses menggunakan nomor HP terdaftar dan kata sandi. Format nomor HP fleksibel (dengan atau tanpa tanda hubung) sehingga memudahkan orang tua santri dalam melakukan autentikasi.</w:t>
       </w:r>
     </w:p>
     <w:p>
@@ -3113,14 +2824,7 @@
           <w:rFonts w:ascii="Times New Roman" w:eastAsia="Times New Roman" w:hAnsi="Times New Roman" w:cs="Times New Roman"/>
           <w:sz w:val="24"/>
         </w:rPr>
-        <w:t>Panel administrasi dibangun menggunakan Filament v5 dengan tema kehijauan (Emerald) dan identitas brand "PP. Miftahul Ihsan". Panel ini mengelola seluruh data operasional pondok den</w:t>
-      </w:r>
-      <w:r>
-        <w:rPr>
-          <w:rFonts w:ascii="Times New Roman" w:eastAsia="Times New Roman" w:hAnsi="Times New Roman" w:cs="Times New Roman"/>
-          <w:sz w:val="24"/>
-        </w:rPr>
-        <w:t>gan kontrol akses berbasis peran (Role-Based Access Control) menggunakan Filament Shield, yang memisahkan hak akses Admin, Operator, Pengasuh (read-only), dan Keamanan.</w:t>
+        <w:t>Panel administrasi dibangun menggunakan Filament v5 dengan tema kehijauan (Emerald) dan identitas brand "PP. Miftahul Ihsan". Panel ini mengelola seluruh data operasional pondok dengan kontrol akses berbasis peran (Role-Based Access Control) menggunakan Filament Shield, yang memisahkan hak akses Admin, Operator, Pengasuh (read-only), dan Keamanan.</w:t>
       </w:r>
     </w:p>
     <w:p>
@@ -3207,14 +2911,7 @@
           <w:rFonts w:ascii="Times New Roman" w:eastAsia="Times New Roman" w:hAnsi="Times New Roman" w:cs="Times New Roman"/>
           <w:sz w:val="24"/>
         </w:rPr>
-        <w:t xml:space="preserve">Dashboard menampilkan widget </w:t>
-      </w:r>
-      <w:r>
-        <w:rPr>
-          <w:rFonts w:ascii="Times New Roman" w:eastAsia="Times New Roman" w:hAnsi="Times New Roman" w:cs="Times New Roman"/>
-          <w:sz w:val="24"/>
-        </w:rPr>
-        <w:t>statistik ringkasan: jumlah santri aktif, tagihan menunggak, eskalasi pelanggaran, dan izin menunggu verifikasi. Menu navigasi tersusun dalam kelompok Data Master, Kedisiplinan, Keuangan, Manajemen Pengguna, dan Sistem &amp; Pengaturan.</w:t>
+        <w:t>Dashboard menampilkan widget statistik ringkasan: jumlah santri aktif, tagihan menunggak, eskalasi pelanggaran, dan izin menunggu verifikasi. Menu navigasi tersusun dalam kelompok Data Master, Kedisiplinan, Keuangan, Manajemen Pengguna, dan Sistem &amp; Pengaturan.</w:t>
       </w:r>
     </w:p>
     <w:p>
@@ -3285,16 +2982,7 @@
           <w:color w:val="000000"/>
           <w:sz w:val="22"/>
         </w:rPr>
-        <w:t>Halaman D</w:t>
-      </w:r>
-      <w:r>
-        <w:rPr>
-          <w:rFonts w:ascii="Times New Roman" w:eastAsia="Times New Roman" w:hAnsi="Times New Roman" w:cs="Times New Roman"/>
-          <w:b w:val="0"/>
-          <w:color w:val="000000"/>
-          <w:sz w:val="22"/>
-        </w:rPr>
-        <w:t>ata Santri</w:t>
+        <w:t>Halaman Data Santri</w:t>
       </w:r>
       <w:bookmarkEnd w:id="4"/>
     </w:p>
@@ -3372,15 +3060,7 @@
           <w:color w:val="000000"/>
           <w:sz w:val="22"/>
         </w:rPr>
-        <w:t xml:space="preserve">Gambar 4.6 </w:t>
-      </w:r>
-      <w:r>
-        <w:rPr>
-          <w:rFonts w:ascii="Times New Roman" w:eastAsia="Times New Roman" w:hAnsi="Times New Roman" w:cs="Times New Roman"/>
-          <w:color w:val="000000"/>
-          <w:sz w:val="22"/>
-        </w:rPr>
-        <w:t xml:space="preserve"> </w:t>
+        <w:t xml:space="preserve">Gambar 4.6  </w:t>
       </w:r>
       <w:r>
         <w:rPr>
@@ -3491,14 +3171,7 @@
           <w:rFonts w:ascii="Times New Roman" w:eastAsia="Times New Roman" w:hAnsi="Times New Roman" w:cs="Times New Roman"/>
           <w:sz w:val="24"/>
         </w:rPr>
-        <w:t>Modul ini menge</w:t>
-      </w:r>
-      <w:r>
-        <w:rPr>
-          <w:rFonts w:ascii="Times New Roman" w:eastAsia="Times New Roman" w:hAnsi="Times New Roman" w:cs="Times New Roman"/>
-          <w:sz w:val="24"/>
-        </w:rPr>
-        <w:t>lola daftar kamar dan asrama beserta kapasitasnya, yang digunakan sebagai referensi penempatan santri.</w:t>
+        <w:t>Modul ini mengelola daftar kamar dan asrama beserta kapasitasnya, yang digunakan sebagai referensi penempatan santri.</w:t>
       </w:r>
     </w:p>
     <w:p>
@@ -3585,14 +3258,7 @@
           <w:sz w:val="24"/>
         </w:rPr>
         <w:lastRenderedPageBreak/>
-        <w:t xml:space="preserve">Pelanggaran santri dicatat dengan kategori pelanggaran dan bobot poin. Setiap pelanggaran memicu </w:t>
-      </w:r>
-      <w:r>
-        <w:rPr>
-          <w:rFonts w:ascii="Times New Roman" w:eastAsia="Times New Roman" w:hAnsi="Times New Roman" w:cs="Times New Roman"/>
-          <w:sz w:val="24"/>
-        </w:rPr>
-        <w:t>notifikasi WhatsApp otomatis kepada wali santri sesuai template yang telah dikonfigurasi.</w:t>
+        <w:t>Pelanggaran santri dicatat dengan kategori pelanggaran dan bobot poin. Setiap pelanggaran memicu notifikasi WhatsApp otomatis kepada wali santri sesuai template yang telah dikonfigurasi.</w:t>
       </w:r>
     </w:p>
     <w:p>
@@ -3678,14 +3344,7 @@
           <w:rFonts w:ascii="Times New Roman" w:eastAsia="Times New Roman" w:hAnsi="Times New Roman" w:cs="Times New Roman"/>
           <w:sz w:val="24"/>
         </w:rPr>
-        <w:t>Pencatatan penghargaan/prestasi santri memberikan keseimbangan penilaian kedisiplinan, dan riwayatnya ditampilkan pada portal</w:t>
-      </w:r>
-      <w:r>
-        <w:rPr>
-          <w:rFonts w:ascii="Times New Roman" w:eastAsia="Times New Roman" w:hAnsi="Times New Roman" w:cs="Times New Roman"/>
-          <w:sz w:val="24"/>
-        </w:rPr>
-        <w:t xml:space="preserve"> wali.</w:t>
+        <w:t>Pencatatan penghargaan/prestasi santri memberikan keseimbangan penilaian kedisiplinan, dan riwayatnya ditampilkan pada portal wali.</w:t>
       </w:r>
     </w:p>
     <w:p>
@@ -3834,15 +3493,7 @@
           <w:color w:val="000000"/>
           <w:sz w:val="22"/>
         </w:rPr>
-        <w:t>Gambar 4.11</w:t>
-      </w:r>
-      <w:r>
-        <w:rPr>
-          <w:rFonts w:ascii="Times New Roman" w:eastAsia="Times New Roman" w:hAnsi="Times New Roman" w:cs="Times New Roman"/>
-          <w:color w:val="000000"/>
-          <w:sz w:val="22"/>
-        </w:rPr>
-        <w:t xml:space="preserve">  </w:t>
+        <w:t xml:space="preserve">Gambar 4.11  </w:t>
       </w:r>
       <w:r>
         <w:rPr>
@@ -3953,14 +3604,7 @@
           <w:rFonts w:ascii="Times New Roman" w:eastAsia="Times New Roman" w:hAnsi="Times New Roman" w:cs="Times New Roman"/>
           <w:sz w:val="24"/>
         </w:rPr>
-        <w:t>Wali santri dapat mengajukan izin keluar pond</w:t>
-      </w:r>
-      <w:r>
-        <w:rPr>
-          <w:rFonts w:ascii="Times New Roman" w:eastAsia="Times New Roman" w:hAnsi="Times New Roman" w:cs="Times New Roman"/>
-          <w:sz w:val="24"/>
-        </w:rPr>
-        <w:t>ok melalui portal; admin/keamanan memverifikasi dan menyetujui atau menolak pengajuan tersebut.</w:t>
+        <w:t>Wali santri dapat mengajukan izin keluar pondok melalui portal; admin/keamanan memverifikasi dan menyetujui atau menolak pengajuan tersebut.</w:t>
       </w:r>
     </w:p>
     <w:p>
@@ -4219,14 +3863,7 @@
           <w:rFonts w:ascii="Times New Roman" w:eastAsia="Times New Roman" w:hAnsi="Times New Roman" w:cs="Times New Roman"/>
           <w:sz w:val="24"/>
         </w:rPr>
-        <w:t xml:space="preserve">Data pengurus pondok </w:t>
-      </w:r>
-      <w:r>
-        <w:rPr>
-          <w:rFonts w:ascii="Times New Roman" w:eastAsia="Times New Roman" w:hAnsi="Times New Roman" w:cs="Times New Roman"/>
-          <w:sz w:val="24"/>
-        </w:rPr>
-        <w:t>(ustadz/ustadzah dan staf) dikelola pada modul ini untuk keperluan operasional dan akuntabilitas.</w:t>
+        <w:t>Data pengurus pondok (ustadz/ustadzah dan staf) dikelola pada modul ini untuk keperluan operasional dan akuntabilitas.</w:t>
       </w:r>
     </w:p>
     <w:p>
@@ -4313,14 +3950,7 @@
           <w:rFonts w:ascii="Times New Roman" w:eastAsia="Times New Roman" w:hAnsi="Times New Roman" w:cs="Times New Roman"/>
           <w:sz w:val="24"/>
         </w:rPr>
-        <w:t xml:space="preserve">Administrator mengelola akun pengguna sistem dan penetapan peran (Admin, Operator, Pengasuh, Keamanan, Wali </w:t>
-      </w:r>
-      <w:r>
-        <w:rPr>
-          <w:rFonts w:ascii="Times New Roman" w:eastAsia="Times New Roman" w:hAnsi="Times New Roman" w:cs="Times New Roman"/>
-          <w:sz w:val="24"/>
-        </w:rPr>
-        <w:t>Santri) beserta hak aksesnya.</w:t>
+        <w:t>Administrator mengelola akun pengguna sistem dan penetapan peran (Admin, Operator, Pengasuh, Keamanan, Wali Santri) beserta hak aksesnya.</w:t>
       </w:r>
     </w:p>
     <w:p>
@@ -4347,21 +3977,7 @@
           <w:rFonts w:ascii="Times New Roman" w:eastAsia="Times New Roman" w:hAnsi="Times New Roman" w:cs="Times New Roman"/>
           <w:sz w:val="24"/>
         </w:rPr>
-        <w:t>Integrasi notifikasi WhatsApp menggunakan pustaka laravel-whatsapp dengan mekanisme Web Sidecar (whatsapp-web.js) yang berjalan sebagai proses terpisah bersama Chromium. Si</w:t>
-      </w:r>
-      <w:r>
-        <w:rPr>
-          <w:rFonts w:ascii="Times New Roman" w:eastAsia="Times New Roman" w:hAnsi="Times New Roman" w:cs="Times New Roman"/>
-          <w:sz w:val="24"/>
-        </w:rPr>
-        <w:t>decar dikelola melalui perintah artisan (whatsapp:sidecar:install, whatsapp:sidecar:start, whatsapp:sidecar:status) dan dapat ditautkan ke nomor WhatsApp melalui pemindaian QR Code atau kode pairing. Status sesi ditampilkan secara live tanpa polling menggu</w:t>
-      </w:r>
-      <w:r>
-        <w:rPr>
-          <w:rFonts w:ascii="Times New Roman" w:eastAsia="Times New Roman" w:hAnsi="Times New Roman" w:cs="Times New Roman"/>
-          <w:sz w:val="24"/>
-        </w:rPr>
-        <w:t>nakan Server-Sent Events (SSE).</w:t>
+        <w:t>Integrasi notifikasi WhatsApp menggunakan pustaka laravel-whatsapp dengan mekanisme Web Sidecar (whatsapp-web.js) yang berjalan sebagai proses terpisah bersama Chromium. Sidecar dikelola melalui perintah artisan (whatsapp:sidecar:install, whatsapp:sidecar:start, whatsapp:sidecar:status) dan dapat ditautkan ke nomor WhatsApp melalui pemindaian QR Code atau kode pairing. Status sesi ditampilkan secara live tanpa polling menggunakan Server-Sent Events (SSE).</w:t>
       </w:r>
     </w:p>
     <w:p>
@@ -4448,14 +4064,7 @@
           <w:rFonts w:ascii="Times New Roman" w:eastAsia="Times New Roman" w:hAnsi="Times New Roman" w:cs="Times New Roman"/>
           <w:sz w:val="24"/>
         </w:rPr>
-        <w:t>Halaman ini menampilkan status sesi WhatsApp secara live (QR Code / pairing code / terhubung), dengan aksi mulai (start), hentikan (stop), hapus sesi (destroy), d</w:t>
-      </w:r>
-      <w:r>
-        <w:rPr>
-          <w:rFonts w:ascii="Times New Roman" w:eastAsia="Times New Roman" w:hAnsi="Times New Roman" w:cs="Times New Roman"/>
-          <w:sz w:val="24"/>
-        </w:rPr>
-        <w:t>an permintaan kode pairing.</w:t>
+        <w:t>Halaman ini menampilkan status sesi WhatsApp secara live (QR Code / pairing code / terhubung), dengan aksi mulai (start), hentikan (stop), hapus sesi (destroy), dan permintaan kode pairing.</w:t>
       </w:r>
     </w:p>
     <w:p>
@@ -4542,14 +4151,7 @@
           <w:sz w:val="24"/>
         </w:rPr>
         <w:lastRenderedPageBreak/>
-        <w:t xml:space="preserve">Template pesan WhatsApp dikelola dengan dukungan variabel dinamis seperti {nama_santri}, {nama_wali}, {jenis}, {deskripsi}, {tagihan}, dan {tanggal}, sehingga pesan otomatis tersusun rapi </w:t>
-      </w:r>
-      <w:r>
-        <w:rPr>
-          <w:rFonts w:ascii="Times New Roman" w:eastAsia="Times New Roman" w:hAnsi="Times New Roman" w:cs="Times New Roman"/>
-          <w:sz w:val="24"/>
-        </w:rPr>
-        <w:t>sesuai konteks notifikasi pelanggaran maupun tagihan.</w:t>
+        <w:t>Template pesan WhatsApp dikelola dengan dukungan variabel dinamis seperti {nama_santri}, {nama_wali}, {jenis}, {deskripsi}, {tagihan}, dan {tanggal}, sehingga pesan otomatis tersusun rapi sesuai konteks notifikasi pelanggaran maupun tagihan.</w:t>
       </w:r>
     </w:p>
     <w:p>
@@ -4635,14 +4237,7 @@
           <w:rFonts w:ascii="Times New Roman" w:eastAsia="Times New Roman" w:hAnsi="Times New Roman" w:cs="Times New Roman"/>
           <w:sz w:val="24"/>
         </w:rPr>
-        <w:t>Seluruh pengiriman notifikasi tercatat pada log dengan status terkirim/gagal. Log yang gagal dapat dikirim ulang (retry) melalui aksi pada baris log, memas</w:t>
-      </w:r>
-      <w:r>
-        <w:rPr>
-          <w:rFonts w:ascii="Times New Roman" w:eastAsia="Times New Roman" w:hAnsi="Times New Roman" w:cs="Times New Roman"/>
-          <w:sz w:val="24"/>
-        </w:rPr>
-        <w:t>tikan wali santri tetap menerima informasi penting.</w:t>
+        <w:t>Seluruh pengiriman notifikasi tercatat pada log dengan status terkirim/gagal. Log yang gagal dapat dikirim ulang (retry) melalui aksi pada baris log, memastikan wali santri tetap menerima informasi penting.</w:t>
       </w:r>
     </w:p>
     <w:p>
@@ -4729,14 +4324,7 @@
           <w:rFonts w:ascii="Times New Roman" w:eastAsia="Times New Roman" w:hAnsi="Times New Roman" w:cs="Times New Roman"/>
           <w:sz w:val="24"/>
         </w:rPr>
-        <w:t>Hak akses berbasis peran dikelola dengan Filament Shield. Role Admin memiliki seluruh izin (207 permission), Operator untuk data operasiona</w:t>
-      </w:r>
-      <w:r>
-        <w:rPr>
-          <w:rFonts w:ascii="Times New Roman" w:eastAsia="Times New Roman" w:hAnsi="Times New Roman" w:cs="Times New Roman"/>
-          <w:sz w:val="24"/>
-        </w:rPr>
-        <w:t>l, Pengasuh bersifat read-only, Keamanan untuk modul kedisiplinan dan perizinan, serta Wali Santri hanya untuk data anaknya.</w:t>
+        <w:t>Hak akses berbasis peran dikelola dengan Filament Shield. Role Admin memiliki seluruh izin (207 permission), Operator untuk data operasional, Pengasuh bersifat read-only, Keamanan untuk modul kedisiplinan dan perizinan, serta Wali Santri hanya untuk data anaknya.</w:t>
       </w:r>
     </w:p>
     <w:p>
@@ -4823,14 +4411,7 @@
           <w:sz w:val="24"/>
         </w:rPr>
         <w:lastRenderedPageBreak/>
-        <w:t>Bobot poin setiap kategori pelanggaran dan ambang batas eskalasi dapat dik</w:t>
-      </w:r>
-      <w:r>
-        <w:rPr>
-          <w:rFonts w:ascii="Times New Roman" w:eastAsia="Times New Roman" w:hAnsi="Times New Roman" w:cs="Times New Roman"/>
-          <w:sz w:val="24"/>
-        </w:rPr>
-        <w:t>onfigurasi, memberikan fleksibilitas pengasuh dalam menerapkan aturan kedisiplinan pondok.</w:t>
+        <w:t>Bobot poin setiap kategori pelanggaran dan ambang batas eskalasi dapat dikonfigurasi, memberikan fleksibilitas pengasuh dalam menerapkan aturan kedisiplinan pondok.</w:t>
       </w:r>
     </w:p>
     <w:p>
@@ -4857,14 +4438,7 @@
           <w:rFonts w:ascii="Times New Roman" w:eastAsia="Times New Roman" w:hAnsi="Times New Roman" w:cs="Times New Roman"/>
           <w:sz w:val="24"/>
         </w:rPr>
-        <w:t>Portal wali santri merupakan panel khusus orang tua/wali dengan tampilan modern dan user-friendly. Setiap wali hanya dapat men</w:t>
-      </w:r>
-      <w:r>
-        <w:rPr>
-          <w:rFonts w:ascii="Times New Roman" w:eastAsia="Times New Roman" w:hAnsi="Times New Roman" w:cs="Times New Roman"/>
-          <w:sz w:val="24"/>
-        </w:rPr>
-        <w:t>gakses data anaknya sendiri, dilindungi oleh scoping data pada level query sehingga wali lain tidak dapat melihat data tersebut.</w:t>
+        <w:t>Portal wali santri merupakan panel khusus orang tua/wali dengan tampilan modern dan user-friendly. Setiap wali hanya dapat mengakses data anaknya sendiri, dilindungi oleh scoping data pada level query sehingga wali lain tidak dapat melihat data tersebut.</w:t>
       </w:r>
     </w:p>
     <w:p>
@@ -4950,14 +4524,7 @@
           <w:rFonts w:ascii="Times New Roman" w:eastAsia="Times New Roman" w:hAnsi="Times New Roman" w:cs="Times New Roman"/>
           <w:sz w:val="24"/>
         </w:rPr>
-        <w:t>Dashboard wali menampilkan kartu statistik (anak asuh, total poin, tagihan terdekat</w:t>
-      </w:r>
-      <w:r>
-        <w:rPr>
-          <w:rFonts w:ascii="Times New Roman" w:eastAsia="Times New Roman" w:hAnsi="Times New Roman" w:cs="Times New Roman"/>
-          <w:sz w:val="24"/>
-        </w:rPr>
-        <w:t>, status keuangan), widget tabel tagihan anak, serta grafik batang perkembangan poin per anak.</w:t>
+        <w:t>Dashboard wali menampilkan kartu statistik (anak asuh, total poin, tagihan terdekat, status keuangan), widget tabel tagihan anak, serta grafik batang perkembangan poin per anak.</w:t>
       </w:r>
     </w:p>
     <w:p>
@@ -5044,14 +4611,7 @@
           <w:rFonts w:ascii="Times New Roman" w:eastAsia="Times New Roman" w:hAnsi="Times New Roman" w:cs="Times New Roman"/>
           <w:sz w:val="24"/>
         </w:rPr>
-        <w:t xml:space="preserve">Wali melihat profil lengkap anaknya (identitas, kamar, dan informasi terkait) sesuai data yang </w:t>
-      </w:r>
-      <w:r>
-        <w:rPr>
-          <w:rFonts w:ascii="Times New Roman" w:eastAsia="Times New Roman" w:hAnsi="Times New Roman" w:cs="Times New Roman"/>
-          <w:sz w:val="24"/>
-        </w:rPr>
-        <w:t>terdaftar di pondok.</w:t>
+        <w:t>Wali melihat profil lengkap anaknya (identitas, kamar, dan informasi terkait) sesuai data yang terdaftar di pondok.</w:t>
       </w:r>
     </w:p>
     <w:p>
@@ -5224,14 +4784,7 @@
           <w:rFonts w:ascii="Times New Roman" w:eastAsia="Times New Roman" w:hAnsi="Times New Roman" w:cs="Times New Roman"/>
           <w:sz w:val="24"/>
         </w:rPr>
-        <w:t xml:space="preserve">Daftar </w:t>
-      </w:r>
-      <w:r>
-        <w:rPr>
-          <w:rFonts w:ascii="Times New Roman" w:eastAsia="Times New Roman" w:hAnsi="Times New Roman" w:cs="Times New Roman"/>
-          <w:sz w:val="24"/>
-        </w:rPr>
-        <w:t>tagihan anak ditampilkan lengkap dengan status pembayaran, membantu wali merencanakan pembayaran tepat waktu.</w:t>
+        <w:t>Daftar tagihan anak ditampilkan lengkap dengan status pembayaran, membantu wali merencanakan pembayaran tepat waktu.</w:t>
       </w:r>
     </w:p>
     <w:p>
@@ -5431,21 +4984,7 @@
           <w:rFonts w:ascii="Times New Roman" w:eastAsia="Times New Roman" w:hAnsi="Times New Roman" w:cs="Times New Roman"/>
           <w:sz w:val="24"/>
         </w:rPr>
-        <w:t>Pengujian sistem dilakukan dengan dua pendekatan: (1) Automated Testing men</w:t>
-      </w:r>
-      <w:r>
-        <w:rPr>
-          <w:rFonts w:ascii="Times New Roman" w:eastAsia="Times New Roman" w:hAnsi="Times New Roman" w:cs="Times New Roman"/>
-          <w:sz w:val="24"/>
-        </w:rPr>
-        <w:t>ggunakan PHPUnit/Pest pada framework Laravel yang mencakup 7 kasus uji (unit dan fitur), dan (2) Pengujian Black-Box melalui pengamatan langsung antarmuka pada browser Google Chrome terhadap 14 skenario fungsional utama. Hasil pengujian black-box disajikan</w:t>
-      </w:r>
-      <w:r>
-        <w:rPr>
-          <w:rFonts w:ascii="Times New Roman" w:eastAsia="Times New Roman" w:hAnsi="Times New Roman" w:cs="Times New Roman"/>
-          <w:sz w:val="24"/>
-        </w:rPr>
-        <w:t xml:space="preserve"> pada Tabel 4.2.</w:t>
+        <w:t>Pengujian sistem dilakukan dengan dua pendekatan: (1) Automated Testing menggunakan PHPUnit/Pest pada framework Laravel yang mencakup 7 kasus uji (unit dan fitur), dan (2) Pengujian Black-Box melalui pengamatan langsung antarmuka pada browser Google Chrome terhadap 14 skenario fungsional utama. Hasil pengujian black-box disajikan pada Tabel 4.2.</w:t>
       </w:r>
     </w:p>
     <w:p>
@@ -5481,11 +5020,11 @@
       </w:tblPr>
       <w:tblGrid>
         <w:gridCol w:w="511"/>
-        <w:gridCol w:w="1580"/>
-        <w:gridCol w:w="1580"/>
-        <w:gridCol w:w="1860"/>
-        <w:gridCol w:w="1860"/>
-        <w:gridCol w:w="750"/>
+        <w:gridCol w:w="1540"/>
+        <w:gridCol w:w="1564"/>
+        <w:gridCol w:w="1839"/>
+        <w:gridCol w:w="1808"/>
+        <w:gridCol w:w="892"/>
       </w:tblGrid>
       <w:tr>
         <w:trPr>
@@ -5666,14 +5205,7 @@
                 <w:rFonts w:ascii="Times New Roman" w:eastAsia="Times New Roman" w:hAnsi="Times New Roman" w:cs="Times New Roman"/>
                 <w:sz w:val="19"/>
               </w:rPr>
-              <w:t xml:space="preserve">Username: admin, Password: password di </w:t>
-            </w:r>
-            <w:r>
-              <w:rPr>
-                <w:rFonts w:ascii="Times New Roman" w:eastAsia="Times New Roman" w:hAnsi="Times New Roman" w:cs="Times New Roman"/>
-                <w:sz w:val="19"/>
-              </w:rPr>
-              <w:t>/admin/login</w:t>
+              <w:t>Username: admin, Password: password di /admin/login</w:t>
             </w:r>
           </w:p>
         </w:tc>
@@ -5722,14 +5254,16 @@
               <w:spacing w:before="60" w:after="60"/>
               <w:jc w:val="center"/>
             </w:pPr>
+            <w:proofErr w:type="spellStart"/>
             <w:r>
               <w:rPr>
                 <w:rFonts w:ascii="Times New Roman" w:eastAsia="Times New Roman" w:hAnsi="Times New Roman" w:cs="Times New Roman"/>
                 <w:b/>
                 <w:sz w:val="19"/>
               </w:rPr>
-              <w:t>PASS</w:t>
-            </w:r>
+              <w:t>Berhasil</w:t>
+            </w:r>
+            <w:proofErr w:type="spellEnd"/>
           </w:p>
         </w:tc>
       </w:tr>
@@ -5805,14 +5339,7 @@
                 <w:rFonts w:ascii="Times New Roman" w:eastAsia="Times New Roman" w:hAnsi="Times New Roman" w:cs="Times New Roman"/>
                 <w:sz w:val="19"/>
               </w:rPr>
-              <w:t xml:space="preserve">Login berhasil dan diarahkan ke </w:t>
-            </w:r>
-            <w:r>
-              <w:rPr>
-                <w:rFonts w:ascii="Times New Roman" w:eastAsia="Times New Roman" w:hAnsi="Times New Roman" w:cs="Times New Roman"/>
-                <w:sz w:val="19"/>
-              </w:rPr>
-              <w:t>Dashboard Wali</w:t>
+              <w:t>Login berhasil dan diarahkan ke Dashboard Wali</w:t>
             </w:r>
           </w:p>
         </w:tc>
@@ -5843,14 +5370,16 @@
               <w:spacing w:before="60" w:after="60"/>
               <w:jc w:val="center"/>
             </w:pPr>
+            <w:proofErr w:type="spellStart"/>
             <w:r>
               <w:rPr>
                 <w:rFonts w:ascii="Times New Roman" w:eastAsia="Times New Roman" w:hAnsi="Times New Roman" w:cs="Times New Roman"/>
                 <w:b/>
                 <w:sz w:val="19"/>
               </w:rPr>
-              <w:t>PASS</w:t>
-            </w:r>
+              <w:t>Berhasil</w:t>
+            </w:r>
+            <w:proofErr w:type="spellEnd"/>
           </w:p>
         </w:tc>
       </w:tr>
@@ -5917,7 +5446,7 @@
                 <w:sz w:val="19"/>
               </w:rPr>
               <w:lastRenderedPageBreak/>
-              <w:t xml:space="preserve">Admin mengakses /wali; wali mengakses </w:t>
+              <w:t xml:space="preserve">Admin mengakses /wali; </w:t>
             </w:r>
             <w:r>
               <w:rPr>
@@ -5925,7 +5454,7 @@
                 <w:sz w:val="19"/>
               </w:rPr>
               <w:lastRenderedPageBreak/>
-              <w:t>/admin</w:t>
+              <w:t>wali mengakses /admin</w:t>
             </w:r>
           </w:p>
         </w:tc>
@@ -5971,7 +5500,15 @@
                 <w:sz w:val="19"/>
               </w:rPr>
               <w:lastRenderedPageBreak/>
-              <w:t>403 sesuai peran pengguna</w:t>
+              <w:t xml:space="preserve">403 sesuai peran </w:t>
+            </w:r>
+            <w:r>
+              <w:rPr>
+                <w:rFonts w:ascii="Times New Roman" w:eastAsia="Times New Roman" w:hAnsi="Times New Roman" w:cs="Times New Roman"/>
+                <w:sz w:val="19"/>
+              </w:rPr>
+              <w:lastRenderedPageBreak/>
+              <w:t>pengguna</w:t>
             </w:r>
           </w:p>
         </w:tc>
@@ -5984,14 +5521,17 @@
               <w:spacing w:before="60" w:after="60"/>
               <w:jc w:val="center"/>
             </w:pPr>
+            <w:proofErr w:type="spellStart"/>
             <w:r>
               <w:rPr>
                 <w:rFonts w:ascii="Times New Roman" w:eastAsia="Times New Roman" w:hAnsi="Times New Roman" w:cs="Times New Roman"/>
                 <w:b/>
                 <w:sz w:val="19"/>
               </w:rPr>
-              <w:t>PASS</w:t>
-            </w:r>
+              <w:lastRenderedPageBreak/>
+              <w:t>Berhasil</w:t>
+            </w:r>
+            <w:proofErr w:type="spellEnd"/>
           </w:p>
         </w:tc>
       </w:tr>
@@ -6049,14 +5589,7 @@
                 <w:rFonts w:ascii="Times New Roman" w:eastAsia="Times New Roman" w:hAnsi="Times New Roman" w:cs="Times New Roman"/>
                 <w:sz w:val="19"/>
               </w:rPr>
-              <w:t>Akses UR</w:t>
-            </w:r>
-            <w:r>
-              <w:rPr>
-                <w:rFonts w:ascii="Times New Roman" w:eastAsia="Times New Roman" w:hAnsi="Times New Roman" w:cs="Times New Roman"/>
-                <w:sz w:val="19"/>
-              </w:rPr>
-              <w:t>L /</w:t>
+              <w:t>Akses URL /</w:t>
             </w:r>
           </w:p>
         </w:tc>
@@ -6105,14 +5638,16 @@
               <w:spacing w:before="60" w:after="60"/>
               <w:jc w:val="center"/>
             </w:pPr>
+            <w:proofErr w:type="spellStart"/>
             <w:r>
               <w:rPr>
                 <w:rFonts w:ascii="Times New Roman" w:eastAsia="Times New Roman" w:hAnsi="Times New Roman" w:cs="Times New Roman"/>
                 <w:b/>
                 <w:sz w:val="19"/>
               </w:rPr>
-              <w:t>PASS</w:t>
-            </w:r>
+              <w:t>Berhasil</w:t>
+            </w:r>
+            <w:proofErr w:type="spellEnd"/>
           </w:p>
         </w:tc>
       </w:tr>
@@ -6219,14 +5754,16 @@
               <w:spacing w:before="60" w:after="60"/>
               <w:jc w:val="center"/>
             </w:pPr>
+            <w:proofErr w:type="spellStart"/>
             <w:r>
               <w:rPr>
                 <w:rFonts w:ascii="Times New Roman" w:eastAsia="Times New Roman" w:hAnsi="Times New Roman" w:cs="Times New Roman"/>
                 <w:b/>
                 <w:sz w:val="19"/>
               </w:rPr>
-              <w:t>PASS</w:t>
-            </w:r>
+              <w:t>Berhasil</w:t>
+            </w:r>
+            <w:proofErr w:type="spellEnd"/>
           </w:p>
         </w:tc>
       </w:tr>
@@ -6333,14 +5870,16 @@
               <w:spacing w:before="60" w:after="60"/>
               <w:jc w:val="center"/>
             </w:pPr>
+            <w:proofErr w:type="spellStart"/>
             <w:r>
               <w:rPr>
                 <w:rFonts w:ascii="Times New Roman" w:eastAsia="Times New Roman" w:hAnsi="Times New Roman" w:cs="Times New Roman"/>
                 <w:b/>
                 <w:sz w:val="19"/>
               </w:rPr>
-              <w:t>PASS</w:t>
-            </w:r>
+              <w:t>Berhasil</w:t>
+            </w:r>
+            <w:proofErr w:type="spellEnd"/>
           </w:p>
         </w:tc>
       </w:tr>
@@ -6416,14 +5955,7 @@
                 <w:rFonts w:ascii="Times New Roman" w:eastAsia="Times New Roman" w:hAnsi="Times New Roman" w:cs="Times New Roman"/>
                 <w:sz w:val="19"/>
               </w:rPr>
-              <w:t>Tagihan tersimpan dan notifikasi WA ke wali terc</w:t>
-            </w:r>
-            <w:r>
-              <w:rPr>
-                <w:rFonts w:ascii="Times New Roman" w:eastAsia="Times New Roman" w:hAnsi="Times New Roman" w:cs="Times New Roman"/>
-                <w:sz w:val="19"/>
-              </w:rPr>
-              <w:t>atat</w:t>
+              <w:t>Tagihan tersimpan dan notifikasi WA ke wali tercatat</w:t>
             </w:r>
           </w:p>
         </w:tc>
@@ -6454,14 +5986,16 @@
               <w:spacing w:before="60" w:after="60"/>
               <w:jc w:val="center"/>
             </w:pPr>
+            <w:proofErr w:type="spellStart"/>
             <w:r>
               <w:rPr>
                 <w:rFonts w:ascii="Times New Roman" w:eastAsia="Times New Roman" w:hAnsi="Times New Roman" w:cs="Times New Roman"/>
                 <w:b/>
                 <w:sz w:val="19"/>
               </w:rPr>
-              <w:t>PASS</w:t>
-            </w:r>
+              <w:t>Berhasil</w:t>
+            </w:r>
+            <w:proofErr w:type="spellEnd"/>
           </w:p>
         </w:tc>
       </w:tr>
@@ -6568,14 +6102,16 @@
               <w:spacing w:before="60" w:after="60"/>
               <w:jc w:val="center"/>
             </w:pPr>
+            <w:proofErr w:type="spellStart"/>
             <w:r>
               <w:rPr>
                 <w:rFonts w:ascii="Times New Roman" w:eastAsia="Times New Roman" w:hAnsi="Times New Roman" w:cs="Times New Roman"/>
                 <w:b/>
                 <w:sz w:val="19"/>
               </w:rPr>
-              <w:t>PASS</w:t>
-            </w:r>
+              <w:t>Berhasil</w:t>
+            </w:r>
+            <w:proofErr w:type="spellEnd"/>
           </w:p>
         </w:tc>
       </w:tr>
@@ -6633,14 +6169,7 @@
                 <w:rFonts w:ascii="Times New Roman" w:eastAsia="Times New Roman" w:hAnsi="Times New Roman" w:cs="Times New Roman"/>
                 <w:sz w:val="19"/>
               </w:rPr>
-              <w:t xml:space="preserve">Sunting </w:t>
-            </w:r>
-            <w:r>
-              <w:rPr>
-                <w:rFonts w:ascii="Times New Roman" w:eastAsia="Times New Roman" w:hAnsi="Times New Roman" w:cs="Times New Roman"/>
-                <w:sz w:val="19"/>
-              </w:rPr>
-              <w:t>template, simpan, render</w:t>
+              <w:t>Sunting template, simpan, render</w:t>
             </w:r>
           </w:p>
         </w:tc>
@@ -6689,14 +6218,16 @@
               <w:spacing w:before="60" w:after="60"/>
               <w:jc w:val="center"/>
             </w:pPr>
+            <w:proofErr w:type="spellStart"/>
             <w:r>
               <w:rPr>
                 <w:rFonts w:ascii="Times New Roman" w:eastAsia="Times New Roman" w:hAnsi="Times New Roman" w:cs="Times New Roman"/>
                 <w:b/>
                 <w:sz w:val="19"/>
               </w:rPr>
-              <w:t>PASS</w:t>
-            </w:r>
+              <w:t>Berhasil</w:t>
+            </w:r>
+            <w:proofErr w:type="spellEnd"/>
           </w:p>
         </w:tc>
       </w:tr>
@@ -6790,14 +6321,7 @@
                 <w:rFonts w:ascii="Times New Roman" w:eastAsia="Times New Roman" w:hAnsi="Times New Roman" w:cs="Times New Roman"/>
                 <w:sz w:val="19"/>
               </w:rPr>
-              <w:t>Aksi retry ter</w:t>
-            </w:r>
-            <w:r>
-              <w:rPr>
-                <w:rFonts w:ascii="Times New Roman" w:eastAsia="Times New Roman" w:hAnsi="Times New Roman" w:cs="Times New Roman"/>
-                <w:sz w:val="19"/>
-              </w:rPr>
-              <w:t>sedia dan berjalan</w:t>
+              <w:t>Aksi retry tersedia dan berjalan</w:t>
             </w:r>
           </w:p>
         </w:tc>
@@ -6810,14 +6334,16 @@
               <w:spacing w:before="60" w:after="60"/>
               <w:jc w:val="center"/>
             </w:pPr>
+            <w:proofErr w:type="spellStart"/>
             <w:r>
               <w:rPr>
                 <w:rFonts w:ascii="Times New Roman" w:eastAsia="Times New Roman" w:hAnsi="Times New Roman" w:cs="Times New Roman"/>
                 <w:b/>
                 <w:sz w:val="19"/>
               </w:rPr>
-              <w:t>PASS</w:t>
-            </w:r>
+              <w:t>Berhasil</w:t>
+            </w:r>
+            <w:proofErr w:type="spellEnd"/>
           </w:p>
         </w:tc>
       </w:tr>
@@ -6924,14 +6450,16 @@
               <w:spacing w:before="60" w:after="60"/>
               <w:jc w:val="center"/>
             </w:pPr>
+            <w:proofErr w:type="spellStart"/>
             <w:r>
               <w:rPr>
                 <w:rFonts w:ascii="Times New Roman" w:eastAsia="Times New Roman" w:hAnsi="Times New Roman" w:cs="Times New Roman"/>
                 <w:b/>
                 <w:sz w:val="19"/>
               </w:rPr>
-              <w:t>PASS</w:t>
-            </w:r>
+              <w:t>Berhasil</w:t>
+            </w:r>
+            <w:proofErr w:type="spellEnd"/>
           </w:p>
         </w:tc>
       </w:tr>
@@ -7007,14 +6535,7 @@
                 <w:rFonts w:ascii="Times New Roman" w:eastAsia="Times New Roman" w:hAnsi="Times New Roman" w:cs="Times New Roman"/>
                 <w:sz w:val="19"/>
               </w:rPr>
-              <w:t xml:space="preserve">Seluruh role dan </w:t>
-            </w:r>
-            <w:r>
-              <w:rPr>
-                <w:rFonts w:ascii="Times New Roman" w:eastAsia="Times New Roman" w:hAnsi="Times New Roman" w:cs="Times New Roman"/>
-                <w:sz w:val="19"/>
-              </w:rPr>
-              <w:t>izin dapat dikelola</w:t>
+              <w:t>Seluruh role dan izin dapat dikelola</w:t>
             </w:r>
           </w:p>
         </w:tc>
@@ -7045,14 +6566,16 @@
               <w:spacing w:before="60" w:after="60"/>
               <w:jc w:val="center"/>
             </w:pPr>
+            <w:proofErr w:type="spellStart"/>
             <w:r>
               <w:rPr>
                 <w:rFonts w:ascii="Times New Roman" w:eastAsia="Times New Roman" w:hAnsi="Times New Roman" w:cs="Times New Roman"/>
                 <w:b/>
                 <w:sz w:val="19"/>
               </w:rPr>
-              <w:t>PASS</w:t>
-            </w:r>
+              <w:t>Berhasil</w:t>
+            </w:r>
+            <w:proofErr w:type="spellEnd"/>
           </w:p>
         </w:tc>
       </w:tr>
@@ -7159,14 +6682,16 @@
               <w:spacing w:before="60" w:after="60"/>
               <w:jc w:val="center"/>
             </w:pPr>
+            <w:proofErr w:type="spellStart"/>
             <w:r>
               <w:rPr>
                 <w:rFonts w:ascii="Times New Roman" w:eastAsia="Times New Roman" w:hAnsi="Times New Roman" w:cs="Times New Roman"/>
                 <w:b/>
                 <w:sz w:val="19"/>
               </w:rPr>
-              <w:t>PASS</w:t>
-            </w:r>
+              <w:t>Berhasil</w:t>
+            </w:r>
+            <w:proofErr w:type="spellEnd"/>
           </w:p>
         </w:tc>
       </w:tr>
@@ -7206,14 +6731,7 @@
                 <w:rFonts w:ascii="Times New Roman" w:eastAsia="Times New Roman" w:hAnsi="Times New Roman" w:cs="Times New Roman"/>
                 <w:sz w:val="19"/>
               </w:rPr>
-              <w:t xml:space="preserve">Widget </w:t>
-            </w:r>
-            <w:r>
-              <w:rPr>
-                <w:rFonts w:ascii="Times New Roman" w:eastAsia="Times New Roman" w:hAnsi="Times New Roman" w:cs="Times New Roman"/>
-                <w:sz w:val="19"/>
-              </w:rPr>
-              <w:t>Welcome dihapus</w:t>
+              <w:t>Widget Welcome dihapus</w:t>
             </w:r>
           </w:p>
         </w:tc>
@@ -7280,14 +6798,16 @@
               <w:spacing w:before="60" w:after="60"/>
               <w:jc w:val="center"/>
             </w:pPr>
+            <w:proofErr w:type="spellStart"/>
             <w:r>
               <w:rPr>
                 <w:rFonts w:ascii="Times New Roman" w:eastAsia="Times New Roman" w:hAnsi="Times New Roman" w:cs="Times New Roman"/>
                 <w:b/>
                 <w:sz w:val="19"/>
               </w:rPr>
-              <w:t>PASS</w:t>
-            </w:r>
+              <w:t>Berhasil</w:t>
+            </w:r>
+            <w:proofErr w:type="spellEnd"/>
           </w:p>
         </w:tc>
       </w:tr>
@@ -7303,21 +6823,7 @@
           <w:rFonts w:ascii="Times New Roman" w:eastAsia="Times New Roman" w:hAnsi="Times New Roman" w:cs="Times New Roman"/>
           <w:sz w:val="24"/>
         </w:rPr>
-        <w:t>Selain pengujian black-box, seluruh Automated Testing yang tertanam pada basis kode berhasil dijalankan dengan hasil 7 tes lulus (19 ase</w:t>
-      </w:r>
-      <w:r>
-        <w:rPr>
-          <w:rFonts w:ascii="Times New Roman" w:eastAsia="Times New Roman" w:hAnsi="Times New Roman" w:cs="Times New Roman"/>
-          <w:sz w:val="24"/>
-        </w:rPr>
-        <w:t>rsi). Daftar tes tersebut adalah: (1) test_the_application_returns_a_successful_response, (2) test_kirim_sukses_memperbarui_status_log, (3) test_kirim_gagal_memperbarui_status_dan_melempar_exception, (4) test_kirim_tanpa_no_hp_menandai_gagal_tanpa_request,</w:t>
-      </w:r>
-      <w:r>
-        <w:rPr>
-          <w:rFonts w:ascii="Times New Roman" w:eastAsia="Times New Roman" w:hAnsi="Times New Roman" w:cs="Times New Roman"/>
-          <w:sz w:val="24"/>
-        </w:rPr>
-        <w:t xml:space="preserve"> (5) test_that_true_is_true, (6) test_render_mengganti_semua_placeholder, dan (7) test_render_placeholder_yang_tidak_diisi_tetap_utuh.</w:t>
+        <w:t>Selain pengujian black-box, seluruh Automated Testing yang tertanam pada basis kode berhasil dijalankan dengan hasil 7 tes lulus (19 asersi). Daftar tes tersebut adalah: (1) test_the_application_returns_a_successful_response, (2) test_kirim_sukses_memperbarui_status_log, (3) test_kirim_gagal_memperbarui_status_dan_melempar_exception, (4) test_kirim_tanpa_no_hp_menandai_gagal_tanpa_request, (5) test_that_true_is_true, (6) test_render_mengganti_semua_placeholder, dan (7) test_render_placeholder_yang_tidak_diisi_tetap_utuh.</w:t>
       </w:r>
     </w:p>
     <w:p>
@@ -7358,14 +6864,21 @@
           <w:rFonts w:ascii="Times New Roman" w:eastAsia="Times New Roman" w:hAnsi="Times New Roman" w:cs="Times New Roman"/>
           <w:sz w:val="24"/>
         </w:rPr>
-        <w:t>1. Tingkat Keberhasilan Fungsional (Success Rate): Dari 14 skenario black</w:t>
+        <w:t>1. Tingkat Keberhasilan Fungsional (Success Rate): Dari 14 skenario black-box dan 7 tes otomatis yang dieksekusi, seluruh kasus uji (100%) dinyatakan PASS. Tidak ditemukan kesalahan fatal maupun kegagalan alur pada modul inti sistem.</w:t>
       </w:r>
+    </w:p>
+    <w:p>
+      <w:pPr>
+        <w:spacing w:after="0" w:line="360" w:lineRule="auto"/>
+        <w:ind w:firstLine="426"/>
+        <w:jc w:val="both"/>
+      </w:pPr>
       <w:r>
         <w:rPr>
           <w:rFonts w:ascii="Times New Roman" w:eastAsia="Times New Roman" w:hAnsi="Times New Roman" w:cs="Times New Roman"/>
           <w:sz w:val="24"/>
         </w:rPr>
-        <w:t>-box dan 7 tes otomatis yang dieksekusi, seluruh kasus uji (100%) dinyatakan PASS. Tidak ditemukan kesalahan fatal maupun kegagalan alur pada modul inti sistem.</w:t>
+        <w:t>2. Keandalan Kontrol Akses (RBAC): Pemisahan hak akses antar peran berjalan konsisten. Admin tidak dapat mengakses portal wali dan sebaliknya; pengasuh dibatasi hanya membaca data; dan wali santri hanya melihat data anaknya sendiri. Hal ini membuktikan penerapan Spatie Laravel Permission dan Filament Shield bekerja sesuai spesifikasi.</w:t>
       </w:r>
     </w:p>
     <w:p>
@@ -7379,56 +6892,37 @@
           <w:rFonts w:ascii="Times New Roman" w:eastAsia="Times New Roman" w:hAnsi="Times New Roman" w:cs="Times New Roman"/>
           <w:sz w:val="24"/>
         </w:rPr>
-        <w:t xml:space="preserve">2. Keandalan Kontrol Akses (RBAC): Pemisahan hak akses antar peran berjalan </w:t>
+        <w:t>3. Efektivitas Notifikasi WhatsApp: Integrasi laravel-whatsapp dengan Web Sidecar terbukti mampu mengirim notifikasi pelanggaran dan tagihan secara otomatis dengan status sesi yang dapat dipantau live. Mekanisme retry pada log notifikasi memberikan keandalan tambahan terhadap kegagalan pengiriman.</w:t>
       </w:r>
+    </w:p>
+    <w:p>
+      <w:pPr>
+        <w:spacing w:after="0" w:line="360" w:lineRule="auto"/>
+        <w:ind w:firstLine="426"/>
+        <w:jc w:val="both"/>
+      </w:pPr>
       <w:r>
         <w:rPr>
           <w:rFonts w:ascii="Times New Roman" w:eastAsia="Times New Roman" w:hAnsi="Times New Roman" w:cs="Times New Roman"/>
           <w:sz w:val="24"/>
         </w:rPr>
-        <w:t>konsisten. Admin tidak dapat mengakses portal wali dan sebaliknya; pengasuh dibatasi hanya membaca data; dan wali santri hanya melihat data anaknya sendiri. Hal ini membuktikan penerapan Spatie Laravel Permission dan Filament Shield bekerja sesuai spesifik</w:t>
+        <w:t xml:space="preserve">4. Kualitas Antarmuka: Landing page dan portal </w:t>
       </w:r>
+      <w:proofErr w:type="spellStart"/>
       <w:r>
         <w:rPr>
           <w:rFonts w:ascii="Times New Roman" w:eastAsia="Times New Roman" w:hAnsi="Times New Roman" w:cs="Times New Roman"/>
           <w:sz w:val="24"/>
         </w:rPr>
-        <w:t>asi.</w:t>
+        <w:t>wali</w:t>
       </w:r>
-    </w:p>
-    <w:p>
-      <w:pPr>
-        <w:spacing w:after="0" w:line="360" w:lineRule="auto"/>
-        <w:ind w:firstLine="426"/>
-        <w:jc w:val="both"/>
-      </w:pPr>
+      <w:proofErr w:type="spellEnd"/>
       <w:r>
         <w:rPr>
           <w:rFonts w:ascii="Times New Roman" w:eastAsia="Times New Roman" w:hAnsi="Times New Roman" w:cs="Times New Roman"/>
           <w:sz w:val="24"/>
         </w:rPr>
-        <w:t>3. Efektivitas Notifikasi WhatsApp: Integrasi laravel-whatsapp dengan Web Sidecar terbukti mampu mengirim notifikasi pelanggaran dan tagihan secara otomatis dengan status sesi yang dapat dipantau live. Mekanisme retry pada log notifikasi memberikan ke</w:t>
-      </w:r>
-      <w:r>
-        <w:rPr>
-          <w:rFonts w:ascii="Times New Roman" w:eastAsia="Times New Roman" w:hAnsi="Times New Roman" w:cs="Times New Roman"/>
-          <w:sz w:val="24"/>
-        </w:rPr>
-        <w:t>andalan tambahan terhadap kegagalan pengiriman.</w:t>
-      </w:r>
-    </w:p>
-    <w:p>
-      <w:pPr>
-        <w:spacing w:after="0" w:line="360" w:lineRule="auto"/>
-        <w:ind w:firstLine="426"/>
-        <w:jc w:val="both"/>
-      </w:pPr>
-      <w:r>
-        <w:rPr>
-          <w:rFonts w:ascii="Times New Roman" w:eastAsia="Times New Roman" w:hAnsi="Times New Roman" w:cs="Times New Roman"/>
-          <w:sz w:val="24"/>
-        </w:rPr>
-        <w:t xml:space="preserve">4. Kualitas Antarmuka: Landing page dan portal wali </w:t>
+        <w:t xml:space="preserve"> </w:t>
       </w:r>
       <w:proofErr w:type="spellStart"/>
       <w:r>
@@ -7496,42 +6990,21 @@
           <w:rFonts w:ascii="Times New Roman" w:eastAsia="Times New Roman" w:hAnsi="Times New Roman" w:cs="Times New Roman"/>
           <w:sz w:val="24"/>
         </w:rPr>
-        <w:t>Sistem memiliki beberapa keunggulan utama: (1) pengelolaan data santri terpusat dengan impor data awal dari berkas Excel pondok; (2) notifikasi WhatsApp otomatis tanpa biaya AP</w:t>
+        <w:t>Sistem memiliki beberapa keunggulan utama: (1) pengelolaan data santri terpusat dengan impor data awal dari berkas Excel pondok; (2) notifikasi WhatsApp otomatis tanpa biaya API tambahan karena memakai Web Sidecar whatsapp-web.js; (3) status gateway live tanpa polling via SSE; (4) portal wali modern dengan scoping data yang aman; dan (5) tema serta identitas pondok yang konsisten di seluruh antarmuka.</w:t>
       </w:r>
+    </w:p>
+    <w:p>
+      <w:pPr>
+        <w:spacing w:after="0" w:line="360" w:lineRule="auto"/>
+        <w:ind w:firstLine="426"/>
+        <w:jc w:val="both"/>
+      </w:pPr>
       <w:r>
         <w:rPr>
           <w:rFonts w:ascii="Times New Roman" w:eastAsia="Times New Roman" w:hAnsi="Times New Roman" w:cs="Times New Roman"/>
           <w:sz w:val="24"/>
         </w:rPr>
-        <w:t>I tambahan karena memakai Web Sidecar whatsapp-web.js; (3) status gateway live tanpa polling via SSE; (4) portal wali modern dengan scoping data yang aman; dan (5) tema serta identitas pondok yang konsisten di seluruh antarmuka.</w:t>
-      </w:r>
-    </w:p>
-    <w:p>
-      <w:pPr>
-        <w:spacing w:after="0" w:line="360" w:lineRule="auto"/>
-        <w:ind w:firstLine="426"/>
-        <w:jc w:val="both"/>
-      </w:pPr>
-      <w:r>
-        <w:rPr>
-          <w:rFonts w:ascii="Times New Roman" w:eastAsia="Times New Roman" w:hAnsi="Times New Roman" w:cs="Times New Roman"/>
-          <w:sz w:val="24"/>
-        </w:rPr>
-        <w:t>Meskipun demikian, sistem m</w:t>
-      </w:r>
-      <w:r>
-        <w:rPr>
-          <w:rFonts w:ascii="Times New Roman" w:eastAsia="Times New Roman" w:hAnsi="Times New Roman" w:cs="Times New Roman"/>
-          <w:sz w:val="24"/>
-        </w:rPr>
-        <w:t>asih memiliki keterbatasan: (1) sidecar WhatsApp bergantung pada ketersediaan Chromium dan kestabilan koneksi; (2) sesi WhatsApp Web dapat terputus jika nomor diblokir atau perangkat seluler kehilangan koneksi; (3) notifikasi hanya mencakup pelanggaran dan</w:t>
-      </w:r>
-      <w:r>
-        <w:rPr>
-          <w:rFonts w:ascii="Times New Roman" w:eastAsia="Times New Roman" w:hAnsi="Times New Roman" w:cs="Times New Roman"/>
-          <w:sz w:val="24"/>
-        </w:rPr>
-        <w:t xml:space="preserve"> tagihan sesuai keputusan pengelola; dan (4) pengujian keamanan lanjutan (penetration testing) serta pengujian beban belum dilakukan.</w:t>
+        <w:t>Meskipun demikian, sistem masih memiliki keterbatasan: (1) sidecar WhatsApp bergantung pada ketersediaan Chromium dan kestabilan koneksi; (2) sesi WhatsApp Web dapat terputus jika nomor diblokir atau perangkat seluler kehilangan koneksi; (3) notifikasi hanya mencakup pelanggaran dan tagihan sesuai keputusan pengelola; dan (4) pengujian keamanan lanjutan (penetration testing) serta pengujian beban belum dilakukan.</w:t>
       </w:r>
     </w:p>
     <w:p>
@@ -7583,14 +7056,21 @@
           <w:rFonts w:ascii="Times New Roman" w:eastAsia="Times New Roman" w:hAnsi="Times New Roman" w:cs="Times New Roman"/>
           <w:sz w:val="24"/>
         </w:rPr>
-        <w:t>Berdasarkan hasil perancangan, implementasi, dan pengujian Sistem Informasi Man</w:t>
+        <w:t>Berdasarkan hasil perancangan, implementasi, dan pengujian Sistem Informasi Manajemen Santri Pondok Pesantren Miftahul Ihsan, dapat ditarik kesimpulan sebagai berikut:</w:t>
       </w:r>
+    </w:p>
+    <w:p>
+      <w:pPr>
+        <w:spacing w:after="0" w:line="360" w:lineRule="auto"/>
+        <w:ind w:firstLine="426"/>
+        <w:jc w:val="both"/>
+      </w:pPr>
       <w:r>
         <w:rPr>
           <w:rFonts w:ascii="Times New Roman" w:eastAsia="Times New Roman" w:hAnsi="Times New Roman" w:cs="Times New Roman"/>
           <w:sz w:val="24"/>
         </w:rPr>
-        <w:t>ajemen Santri Pondok Pesantren Miftahul Ihsan, dapat ditarik kesimpulan sebagai berikut:</w:t>
+        <w:t>1. Telah berhasil dirancang dan dibangun sistem informasi manajemen santri berbasis web menggunakan Laravel 13, Filament v5, dan Livewire yang mencakup pengelolaan data santri, kedisiplinan (pelanggaran dan penghargaan), tagihan dan pembayaran, perizinan, tahfidz, riwayat kesehatan, serta pengguna dengan kontrol akses berbasis peran (Admin, Operator, Pengasuh read-only, Keamanan, dan Wali Santri).</w:t>
       </w:r>
     </w:p>
     <w:p>
@@ -7604,14 +7084,21 @@
           <w:rFonts w:ascii="Times New Roman" w:eastAsia="Times New Roman" w:hAnsi="Times New Roman" w:cs="Times New Roman"/>
           <w:sz w:val="24"/>
         </w:rPr>
-        <w:t>1. Telah berhasil dirancang dan dibangun sistem informasi manajemen santri berbasis web menggunakan Laravel 13, Filament v5, dan Livewire yang mencakup pengelolaan dat</w:t>
+        <w:t>2. Sistem berhasil mengintegrasikan notifikasi WhatsApp melalui laravel-whatsapp Web Sidecar untuk notifikasi pelanggaran dan tagihan, dengan fitur kelola sesi (scan QR / pairing code), status live via SSE, template pesan, dan log notifikasi yang dapat dikirim ulang (retry).</w:t>
       </w:r>
+    </w:p>
+    <w:p>
+      <w:pPr>
+        <w:spacing w:after="0" w:line="360" w:lineRule="auto"/>
+        <w:ind w:firstLine="426"/>
+        <w:jc w:val="both"/>
+      </w:pPr>
       <w:r>
         <w:rPr>
           <w:rFonts w:ascii="Times New Roman" w:eastAsia="Times New Roman" w:hAnsi="Times New Roman" w:cs="Times New Roman"/>
           <w:sz w:val="24"/>
         </w:rPr>
-        <w:t>a santri, kedisiplinan (pelanggaran dan penghargaan), tagihan dan pembayaran, perizinan, tahfidz, riwayat kesehatan, serta pengguna dengan kontrol akses berbasis peran (Admin, Operator, Pengasuh read-only, Keamanan, dan Wali Santri).</w:t>
+        <w:t>3. Portal wali santri berhasil diimplementasikan dengan login menggunakan nomor HP, tampilan modern dan user-friendly, serta scoping data yang menjamin wali hanya dapat mengakses data anaknya sendiri.</w:t>
       </w:r>
     </w:p>
     <w:p>
@@ -7625,56 +7112,39 @@
           <w:rFonts w:ascii="Times New Roman" w:eastAsia="Times New Roman" w:hAnsi="Times New Roman" w:cs="Times New Roman"/>
           <w:sz w:val="24"/>
         </w:rPr>
-        <w:t>2. Sistem berhasil men</w:t>
+        <w:t xml:space="preserve">4. Hasil pengujian black-box terhadap 14 skenario dan automated testing terhadap 7 kasus uji menunjukkan tingkat keberhasilan 100% (PASS), </w:t>
       </w:r>
+      <w:proofErr w:type="spellStart"/>
       <w:r>
         <w:rPr>
           <w:rFonts w:ascii="Times New Roman" w:eastAsia="Times New Roman" w:hAnsi="Times New Roman" w:cs="Times New Roman"/>
           <w:sz w:val="24"/>
         </w:rPr>
-        <w:t>gintegrasikan notifikasi WhatsApp melalui laravel-whatsapp Web Sidecar untuk notifikasi pelanggaran dan tagihan, dengan fitur kelola sesi (scan QR / pairing code), status live via SSE, template pesan, dan log notifikasi yang dapat dikirim ulang (retry).</w:t>
+        <w:t>membuktikan</w:t>
       </w:r>
-    </w:p>
-    <w:p>
-      <w:pPr>
-        <w:spacing w:after="0" w:line="360" w:lineRule="auto"/>
-        <w:ind w:firstLine="426"/>
-        <w:jc w:val="both"/>
-      </w:pPr>
+      <w:proofErr w:type="spellEnd"/>
       <w:r>
         <w:rPr>
           <w:rFonts w:ascii="Times New Roman" w:eastAsia="Times New Roman" w:hAnsi="Times New Roman" w:cs="Times New Roman"/>
           <w:sz w:val="24"/>
         </w:rPr>
-        <w:t>3.</w:t>
+        <w:t xml:space="preserve"> </w:t>
       </w:r>
+      <w:proofErr w:type="spellStart"/>
       <w:r>
         <w:rPr>
           <w:rFonts w:ascii="Times New Roman" w:eastAsia="Times New Roman" w:hAnsi="Times New Roman" w:cs="Times New Roman"/>
           <w:sz w:val="24"/>
         </w:rPr>
-        <w:t xml:space="preserve"> Portal wali santri berhasil diimplementasikan dengan login menggunakan nomor HP, tampilan modern dan user-friendly, serta scoping data yang menjamin wali hanya dapat mengakses data anaknya sendiri.</w:t>
+        <w:t>seluruh</w:t>
       </w:r>
-    </w:p>
-    <w:p>
-      <w:pPr>
-        <w:spacing w:after="0" w:line="360" w:lineRule="auto"/>
-        <w:ind w:firstLine="426"/>
-        <w:jc w:val="both"/>
-      </w:pPr>
+      <w:proofErr w:type="spellEnd"/>
       <w:r>
         <w:rPr>
           <w:rFonts w:ascii="Times New Roman" w:eastAsia="Times New Roman" w:hAnsi="Times New Roman" w:cs="Times New Roman"/>
           <w:sz w:val="24"/>
         </w:rPr>
-        <w:t>4. Hasil pengujian black-box terhadap 14 skenario dan aut</w:t>
-      </w:r>
-      <w:r>
-        <w:rPr>
-          <w:rFonts w:ascii="Times New Roman" w:eastAsia="Times New Roman" w:hAnsi="Times New Roman" w:cs="Times New Roman"/>
-          <w:sz w:val="24"/>
-        </w:rPr>
-        <w:t xml:space="preserve">omated testing terhadap 7 kasus uji menunjukkan tingkat keberhasilan 100% (PASS), membuktikan seluruh </w:t>
+        <w:t xml:space="preserve"> </w:t>
       </w:r>
       <w:proofErr w:type="spellStart"/>
       <w:r>
@@ -7751,14 +7221,7 @@
           <w:rFonts w:ascii="Times New Roman" w:eastAsia="Times New Roman" w:hAnsi="Times New Roman" w:cs="Times New Roman"/>
           <w:sz w:val="24"/>
         </w:rPr>
-        <w:t>Untuk pengembangan sistem di masa mendatang, diajukan beberapa sar</w:t>
-      </w:r>
-      <w:r>
-        <w:rPr>
-          <w:rFonts w:ascii="Times New Roman" w:eastAsia="Times New Roman" w:hAnsi="Times New Roman" w:cs="Times New Roman"/>
-          <w:sz w:val="24"/>
-        </w:rPr>
-        <w:t>an sebagai berikut:</w:t>
+        <w:t>Untuk pengembangan sistem di masa mendatang, diajukan beberapa saran sebagai berikut:</w:t>
       </w:r>
     </w:p>
     <w:p>
@@ -7786,14 +7249,7 @@
           <w:rFonts w:ascii="Times New Roman" w:eastAsia="Times New Roman" w:hAnsi="Times New Roman" w:cs="Times New Roman"/>
           <w:sz w:val="24"/>
         </w:rPr>
-        <w:t>2. Perluasan Cakupan Notifikasi: Cakupan notifik</w:t>
-      </w:r>
-      <w:r>
-        <w:rPr>
-          <w:rFonts w:ascii="Times New Roman" w:eastAsia="Times New Roman" w:hAnsi="Times New Roman" w:cs="Times New Roman"/>
-          <w:sz w:val="24"/>
-        </w:rPr>
-        <w:t>asi WhatsApp dapat diperluas, misalnya untuk pengingat pembayaran otomatis (reminder tagihan), informasi kegiatan pondok, dan pengumuman penting lainnya.</w:t>
+        <w:t>2. Perluasan Cakupan Notifikasi: Cakupan notifikasi WhatsApp dapat diperluas, misalnya untuk pengingat pembayaran otomatis (reminder tagihan), informasi kegiatan pondok, dan pengumuman penting lainnya.</w:t>
       </w:r>
     </w:p>
     <w:p>
@@ -7808,35 +7264,21 @@
           <w:sz w:val="24"/>
         </w:rPr>
         <w:lastRenderedPageBreak/>
-        <w:t>3. Redundansi Gateway WhatsApp: Disarankan menyediakan lebih dari satu sesi/nomor WhatsApp sebagai cad</w:t>
+        <w:t>3. Redundansi Gateway WhatsApp: Disarankan menyediakan lebih dari satu sesi/nomor WhatsApp sebagai cadangan (failover) agar pengiriman notifikasi tetap berjalan jika satu sesi terputus.</w:t>
       </w:r>
+    </w:p>
+    <w:p>
+      <w:pPr>
+        <w:spacing w:after="0" w:line="360" w:lineRule="auto"/>
+        <w:ind w:firstLine="426"/>
+        <w:jc w:val="both"/>
+      </w:pPr>
       <w:r>
         <w:rPr>
           <w:rFonts w:ascii="Times New Roman" w:eastAsia="Times New Roman" w:hAnsi="Times New Roman" w:cs="Times New Roman"/>
           <w:sz w:val="24"/>
         </w:rPr>
-        <w:t>angan (failover) agar pengiriman notifikasi tetap berjalan jika satu sesi terputus.</w:t>
-      </w:r>
-    </w:p>
-    <w:p>
-      <w:pPr>
-        <w:spacing w:after="0" w:line="360" w:lineRule="auto"/>
-        <w:ind w:firstLine="426"/>
-        <w:jc w:val="both"/>
-      </w:pPr>
-      <w:r>
-        <w:rPr>
-          <w:rFonts w:ascii="Times New Roman" w:eastAsia="Times New Roman" w:hAnsi="Times New Roman" w:cs="Times New Roman"/>
-          <w:sz w:val="24"/>
-        </w:rPr>
-        <w:t>4. Pengujian Lanjutan: Perlu dilakukan penetration testing dan load testing dengan jumlah santri dalam skala besar untuk mengevaluasi keamanan dan skalabilitas sistem sebel</w:t>
-      </w:r>
-      <w:r>
-        <w:rPr>
-          <w:rFonts w:ascii="Times New Roman" w:eastAsia="Times New Roman" w:hAnsi="Times New Roman" w:cs="Times New Roman"/>
-          <w:sz w:val="24"/>
-        </w:rPr>
-        <w:t>um diterapkan secara penuh di lingkungan produksi.</w:t>
+        <w:t>4. Pengujian Lanjutan: Perlu dilakukan penetration testing dan load testing dengan jumlah santri dalam skala besar untuk mengevaluasi keamanan dan skalabilitas sistem sebelum diterapkan secara penuh di lingkungan produksi.</w:t>
       </w:r>
     </w:p>
     <w:sectPr>
@@ -8433,11 +7875,6 @@
     <w:lsdException w:name="Book Title" w:uiPriority="33" w:qFormat="1"/>
     <w:lsdException w:name="Bibliography" w:semiHidden="1" w:uiPriority="37" w:unhideWhenUsed="1"/>
     <w:lsdException w:name="TOC Heading" w:semiHidden="1" w:uiPriority="39" w:unhideWhenUsed="1" w:qFormat="1"/>
-    <w:lsdException w:name="Plain Table 5" w:semiHidden="1" w:unhideWhenUsed="1"/>
-    <w:lsdException w:name="Grid Table Light" w:semiHidden="1" w:unhideWhenUsed="1"/>
-    <w:lsdException w:name="Grid Table 1 Light" w:semiHidden="1" w:unhideWhenUsed="1"/>
-    <w:lsdException w:name="Grid Table 2" w:semiHidden="1" w:unhideWhenUsed="1"/>
-    <w:lsdException w:name="Grid Table 3" w:semiHidden="1" w:unhideWhenUsed="1"/>
     <w:lsdException w:name="Grid Table 4" w:uiPriority="49"/>
     <w:lsdException w:name="Grid Table 5 Dark" w:uiPriority="50"/>
     <w:lsdException w:name="Grid Table 6 Colorful" w:uiPriority="51"/>

</xml_diff>